<commit_message>
Rapidité : boucle top-1 puis top-3 et fenêtre de contexte réduite
Mesure sur le Space (7.6) : 228 s de génération pour cinq sources relues
deux fois. La meilleure source est désormais lue seule ; les trois
meilleures ne le sont que si la réponse est incomplète ou non vérifiée.
Texte lu par le modèle : -64 % (top-1 suffisant) à -50 % (pire cas).
</commit_message>
<xml_diff>
--- a/docs/rapport/Rapport_Insurance_Claims_Assistance_v19.docx
+++ b/docs/rapport/Rapport_Insurance_Claims_Assistance_v19.docx
@@ -303,14 +303,24 @@
         <w:t xml:space="preserve">réponses typées et vérifiées</w:t>
       </w:r>
       <w:r>
-        <w:t xml:space="preserve">, image Docker allégée, réponses plus rapides, suite de </w:t>
+        <w:t xml:space="preserve">, </w:t>
       </w:r>
       <w:r>
         <w:rPr>
           <w:b/>
           <w:bCs/>
         </w:rPr>
-        <w:t xml:space="preserve">101 tests automatisés</w:t>
+        <w:t xml:space="preserve">boucle top-1 puis top-3</w:t>
+      </w:r>
+      <w:r>
+        <w:t xml:space="preserve"> qui réduit de moitié à deux tiers le texte lu par le modèle, image Docker allégée, suite de </w:t>
+      </w:r>
+      <w:r>
+        <w:rPr>
+          <w:b/>
+          <w:bCs/>
+        </w:rPr>
+        <w:t xml:space="preserve">104 tests automatisés</w:t>
       </w:r>
       <w:r>
         <w:t xml:space="preserve">, évaluation reproductible et déploiement conditionné à la réussite des tests.</w:t>
@@ -848,7 +858,7 @@
                 <w:sz w:val="19"/>
                 <w:szCs w:val="19"/>
               </w:rPr>
-              <w:t xml:space="preserve">101</w:t>
+              <w:t xml:space="preserve">104</w:t>
             </w:r>
           </w:p>
         </w:tc>
@@ -877,7 +887,7 @@
                 <w:sz w:val="19"/>
                 <w:szCs w:val="19"/>
               </w:rPr>
-              <w:t xml:space="preserve">95 exécutés localement + 6 tests HTTP exécutés en intégration continue</w:t>
+              <w:t xml:space="preserve">98 exécutés localement + 6 tests HTTP exécutés en intégration continue</w:t>
             </w:r>
           </w:p>
         </w:tc>
@@ -1688,7 +1698,7 @@
                 <w:sz w:val="19"/>
                 <w:szCs w:val="19"/>
               </w:rPr>
-              <w:t xml:space="preserve">cinq sources toujours transmises</w:t>
+              <w:t xml:space="preserve">top-1 d’abord, top-3 seulement si la réponse est incomplète ou non vérifiée (§ 4.6)</w:t>
             </w:r>
           </w:p>
         </w:tc>
@@ -1717,7 +1727,7 @@
                 <w:sz w:val="19"/>
                 <w:szCs w:val="19"/>
               </w:rPr>
-              <w:t xml:space="preserve">perspective (§ 11)</w:t>
+              <w:t xml:space="preserve">fait</w:t>
             </w:r>
           </w:p>
         </w:tc>
@@ -3123,7 +3133,7 @@
                 <w:sz w:val="19"/>
                 <w:szCs w:val="19"/>
               </w:rPr>
-              <w:t xml:space="preserve">101 tests et évaluation de la recherche</w:t>
+              <w:t xml:space="preserve">104 tests et évaluation de la recherche</w:t>
             </w:r>
           </w:p>
         </w:tc>
@@ -5570,7 +5580,7 @@
                 <w:sz w:val="19"/>
                 <w:szCs w:val="19"/>
               </w:rPr>
-              <w:t xml:space="preserve">aucun extrait vérifiable après une révision</w:t>
+              <w:t xml:space="preserve">aucun extrait vérifiable après les deux étapes</w:t>
             </w:r>
           </w:p>
         </w:tc>
@@ -5627,17 +5637,17 @@
         <w:jc w:val="both"/>
       </w:pPr>
       <w:r>
-        <w:t xml:space="preserve">Si la première réponse n’est pas exploitable (JSON invalide ou aucun extrait retrouvé), une </w:t>
+        <w:t xml:space="preserve">La réponse est construite par une </w:t>
       </w:r>
       <w:r>
         <w:rPr>
           <w:b/>
           <w:bCs/>
         </w:rPr>
-        <w:t xml:space="preserve">révision</w:t>
-      </w:r>
-      <w:r>
-        <w:t xml:space="preserve"> est demandée en rappelant la question, les sources, la réponse fautive et les identifiants autorisés. Cette logique prolonge un constat des essais réels de la version 7 : le modèle omettait parfois les citations malgré la consigne. La température est fixée à 0,1.</w:t>
+        <w:t xml:space="preserve">boucle en deux étapes</w:t>
+      </w:r>
+      <w:r>
+        <w:t xml:space="preserve"> décrite au § 4.6 : la meilleure source seule, puis les trois meilleures si nécessaire. La seconde étape tient lieu de révision lorsque la première sortie n’est pas exploitable (JSON invalide ou aucun extrait retrouvé). La température est fixée à 0,1.</w:t>
       </w:r>
     </w:p>
     <w:p>
@@ -5658,7 +5668,7 @@
         <w:pStyle w:val="Heading2"/>
       </w:pPr>
       <w:r>
-        <w:t xml:space="preserve">4.6 Rapidité des réponses</w:t>
+        <w:t xml:space="preserve">4.6 Rapidité : boucle top-1 puis top-3</w:t>
       </w:r>
     </w:p>
     <w:p>
@@ -5667,7 +5677,36 @@
         <w:jc w:val="both"/>
       </w:pPr>
       <w:r>
-        <w:t xml:space="preserve">Les mesures des versions précédentes montrent que la génération représente l’essentiel du temps de réponse (environ 96 % sur un essai de la version 7.2, où la génération prenait 91 secondes sur la machine de développement). La version 19 agit donc sur la génération :</w:t>
+        <w:t xml:space="preserve">Un essai sur le Space en version 7.6 donne la mesure du problème : pour la question « assurance responsabilité civile », la génération a duré </w:t>
+      </w:r>
+      <w:r>
+        <w:rPr>
+          <w:b/>
+          <w:bCs/>
+        </w:rPr>
+        <w:t xml:space="preserve">228 secondes</w:t>
+      </w:r>
+      <w:r>
+        <w:t xml:space="preserve">, pour un résultat finalement rejeté faute de citations. Sur le processeur partagé de l’offre gratuite, le temps est dominé par la </w:t>
+      </w:r>
+      <w:r>
+        <w:rPr>
+          <w:b/>
+          <w:bCs/>
+        </w:rPr>
+        <w:t xml:space="preserve">lecture du contexte</w:t>
+      </w:r>
+      <w:r>
+        <w:t xml:space="preserve"> par le modèle : cinq sources de 1 500 caractères, relues intégralement lors de la seconde tentative.</w:t>
+      </w:r>
+    </w:p>
+    <w:p>
+      <w:pPr>
+        <w:spacing w:after="120" w:line="288"/>
+        <w:jc w:val="both"/>
+      </w:pPr>
+      <w:r>
+        <w:t xml:space="preserve">Suivant l’article 2 de la série, la version 19 ne transmet plus systématiquement cinq sources :</w:t>
       </w:r>
     </w:p>
     <w:p>
@@ -5684,21 +5723,10 @@
           <w:b/>
           <w:bCs/>
         </w:rPr>
-        <w:t xml:space="preserve">Longueur bornée</w:t>
-      </w:r>
-      <w:r>
-        <w:t xml:space="preserve"> (</w:t>
-      </w:r>
-      <w:r>
-        <w:rPr>
-          <w:rFonts w:ascii="Consolas" w:cs="Consolas" w:eastAsia="Consolas" w:hAnsi="Consolas"/>
-          <w:sz w:val="19"/>
-          <w:szCs w:val="19"/>
-        </w:rPr>
-        <w:t xml:space="preserve">num_predict = 500</w:t>
-      </w:r>
-      <w:r>
-        <w:t xml:space="preserve"> jetons, la réponse JSON contenant aussi les extraits) : le temps de génération croît avec la longueur de la réponse ; une borne évite les réponses inutilement longues.</w:t>
+        <w:t xml:space="preserve">Étape 1 — top-1</w:t>
+      </w:r>
+      <w:r>
+        <w:t xml:space="preserve"> : la meilleure source seule, limitée à 1 200 caractères. Si la réponse est complète et appuyée par un extrait vérifié, la boucle s’arrête.</w:t>
       </w:r>
     </w:p>
     <w:p>
@@ -5715,10 +5743,19 @@
           <w:b/>
           <w:bCs/>
         </w:rPr>
-        <w:t xml:space="preserve">Modèle maintenu en mémoire</w:t>
-      </w:r>
-      <w:r>
-        <w:t xml:space="preserve"> (</w:t>
+        <w:t xml:space="preserve">Étape 2 — top-3</w:t>
+      </w:r>
+      <w:r>
+        <w:t xml:space="preserve"> : sinon, les trois meilleures sources, limitées à 900 caractères chacune. Cette étape sert aussi de seconde chance si la sortie de l’étape 1 était inexploitable.</w:t>
+      </w:r>
+    </w:p>
+    <w:p>
+      <w:pPr>
+        <w:spacing w:after="120" w:line="288"/>
+        <w:jc w:val="both"/>
+      </w:pPr>
+      <w:r>
+        <w:t xml:space="preserve">Le critère d’arrêt repose sur les indicateurs typés </w:t>
       </w:r>
       <w:r>
         <w:rPr>
@@ -5726,59 +5763,584 @@
           <w:sz w:val="19"/>
           <w:szCs w:val="19"/>
         </w:rPr>
-        <w:t xml:space="preserve">keep_alive = 30 min</w:t>
-      </w:r>
-      <w:r>
-        <w:t xml:space="preserve">) : sans ce réglage, Ollama peut décharger le modèle entre deux questions et le recharger coûte plusieurs secondes.</w:t>
-      </w:r>
-    </w:p>
-    <w:p>
-      <w:pPr>
-        <w:pStyle w:val="ListParagraph"/>
-        <w:numPr>
-          <w:ilvl w:val="0"/>
-          <w:numId w:val="3"/>
-        </w:numPr>
-        <w:spacing w:after="60" w:line="276"/>
-      </w:pPr>
+        <w:t xml:space="preserve">answer_found</w:t>
+      </w:r>
+      <w:r>
+        <w:t xml:space="preserve"> et </w:t>
+      </w:r>
+      <w:r>
+        <w:rPr>
+          <w:rFonts w:ascii="Consolas" w:cs="Consolas" w:eastAsia="Consolas" w:hAnsi="Consolas"/>
+          <w:sz w:val="19"/>
+          <w:szCs w:val="19"/>
+        </w:rPr>
+        <w:t xml:space="preserve">complete_answer_found</w:t>
+      </w:r>
+      <w:r>
+        <w:t xml:space="preserve">, combinés à la vérification des extraits, et non sur la confiance déclarée. Une réponse « non trouvée » à l’étape 1 ne suffit pas à conclure : la bonne fiche peut être deuxième ou troisième.</w:t>
+      </w:r>
+    </w:p>
+    <w:tbl>
+      <w:tblPr>
+        <w:tblW w:type="dxa" w:w="9026"/>
+        <w:tblBorders>
+          <w:top w:val="single" w:color="auto" w:sz="4"/>
+          <w:left w:val="single" w:color="auto" w:sz="4"/>
+          <w:bottom w:val="single" w:color="auto" w:sz="4"/>
+          <w:right w:val="single" w:color="auto" w:sz="4"/>
+          <w:insideH w:val="single" w:color="auto" w:sz="4"/>
+          <w:insideV w:val="single" w:color="auto" w:sz="4"/>
+        </w:tblBorders>
+      </w:tblPr>
+      <w:tblGrid>
+        <w:gridCol w:w="5235"/>
+        <w:gridCol w:w="1444"/>
+        <w:gridCol w:w="2347"/>
+      </w:tblGrid>
+      <w:tr>
+        <w:trPr>
+          <w:tblHeader/>
+        </w:trPr>
+        <w:tc>
+          <w:tcPr>
+            <w:tcW w:type="dxa" w:w="5235"/>
+            <w:tcBorders>
+              <w:top w:val="single" w:color="BFBFBF" w:sz="4"/>
+              <w:left w:val="single" w:color="BFBFBF" w:sz="4"/>
+              <w:bottom w:val="single" w:color="BFBFBF" w:sz="4"/>
+              <w:right w:val="single" w:color="BFBFBF" w:sz="4"/>
+            </w:tcBorders>
+            <w:shd w:fill="1F3864" w:color="auto" w:val="clear"/>
+            <w:tcMar>
+              <w:top w:type="dxa" w:w="60"/>
+              <w:left w:type="dxa" w:w="100"/>
+              <w:bottom w:type="dxa" w:w="60"/>
+              <w:right w:type="dxa" w:w="100"/>
+            </w:tcMar>
+          </w:tcPr>
+          <w:p>
+            <w:pPr>
+              <w:spacing w:after="0" w:line="260"/>
+            </w:pPr>
+            <w:r>
+              <w:rPr>
+                <w:b/>
+                <w:bCs/>
+                <w:color w:val="FFFFFF"/>
+                <w:sz w:val="19"/>
+                <w:szCs w:val="19"/>
+              </w:rPr>
+              <w:t xml:space="preserve">Taille du texte lu par le modèle (moyenne sur 201 questions)</w:t>
+            </w:r>
+          </w:p>
+        </w:tc>
+        <w:tc>
+          <w:tcPr>
+            <w:tcW w:type="dxa" w:w="1444"/>
+            <w:tcBorders>
+              <w:top w:val="single" w:color="BFBFBF" w:sz="4"/>
+              <w:left w:val="single" w:color="BFBFBF" w:sz="4"/>
+              <w:bottom w:val="single" w:color="BFBFBF" w:sz="4"/>
+              <w:right w:val="single" w:color="BFBFBF" w:sz="4"/>
+            </w:tcBorders>
+            <w:shd w:fill="1F3864" w:color="auto" w:val="clear"/>
+            <w:tcMar>
+              <w:top w:type="dxa" w:w="60"/>
+              <w:left w:type="dxa" w:w="100"/>
+              <w:bottom w:type="dxa" w:w="60"/>
+              <w:right w:type="dxa" w:w="100"/>
+            </w:tcMar>
+          </w:tcPr>
+          <w:p>
+            <w:pPr>
+              <w:spacing w:after="0" w:line="260"/>
+            </w:pPr>
+            <w:r>
+              <w:rPr>
+                <w:b/>
+                <w:bCs/>
+                <w:color w:val="FFFFFF"/>
+                <w:sz w:val="19"/>
+                <w:szCs w:val="19"/>
+              </w:rPr>
+              <w:t xml:space="preserve">Caractères</w:t>
+            </w:r>
+          </w:p>
+        </w:tc>
+        <w:tc>
+          <w:tcPr>
+            <w:tcW w:type="dxa" w:w="2347"/>
+            <w:tcBorders>
+              <w:top w:val="single" w:color="BFBFBF" w:sz="4"/>
+              <w:left w:val="single" w:color="BFBFBF" w:sz="4"/>
+              <w:bottom w:val="single" w:color="BFBFBF" w:sz="4"/>
+              <w:right w:val="single" w:color="BFBFBF" w:sz="4"/>
+            </w:tcBorders>
+            <w:shd w:fill="1F3864" w:color="auto" w:val="clear"/>
+            <w:tcMar>
+              <w:top w:type="dxa" w:w="60"/>
+              <w:left w:type="dxa" w:w="100"/>
+              <w:bottom w:type="dxa" w:w="60"/>
+              <w:right w:type="dxa" w:w="100"/>
+            </w:tcMar>
+          </w:tcPr>
+          <w:p>
+            <w:pPr>
+              <w:spacing w:after="0" w:line="260"/>
+            </w:pPr>
+            <w:r>
+              <w:rPr>
+                <w:b/>
+                <w:bCs/>
+                <w:color w:val="FFFFFF"/>
+                <w:sz w:val="19"/>
+                <w:szCs w:val="19"/>
+              </w:rPr>
+              <w:t xml:space="preserve">Écart</w:t>
+            </w:r>
+          </w:p>
+        </w:tc>
+      </w:tr>
+      <w:tr>
+        <w:tc>
+          <w:tcPr>
+            <w:tcW w:type="dxa" w:w="5235"/>
+            <w:tcBorders>
+              <w:top w:val="single" w:color="BFBFBF" w:sz="4"/>
+              <w:left w:val="single" w:color="BFBFBF" w:sz="4"/>
+              <w:bottom w:val="single" w:color="BFBFBF" w:sz="4"/>
+              <w:right w:val="single" w:color="BFBFBF" w:sz="4"/>
+            </w:tcBorders>
+            <w:tcMar>
+              <w:top w:type="dxa" w:w="60"/>
+              <w:left w:type="dxa" w:w="100"/>
+              <w:bottom w:type="dxa" w:w="60"/>
+              <w:right w:type="dxa" w:w="100"/>
+            </w:tcMar>
+          </w:tcPr>
+          <w:p>
+            <w:pPr>
+              <w:spacing w:after="0" w:line="260"/>
+            </w:pPr>
+            <w:r>
+              <w:rPr>
+                <w:sz w:val="19"/>
+                <w:szCs w:val="19"/>
+              </w:rPr>
+              <w:t xml:space="preserve">Version 7.6 : un appel (5 sources)</w:t>
+            </w:r>
+          </w:p>
+        </w:tc>
+        <w:tc>
+          <w:tcPr>
+            <w:tcW w:type="dxa" w:w="1444"/>
+            <w:tcBorders>
+              <w:top w:val="single" w:color="BFBFBF" w:sz="4"/>
+              <w:left w:val="single" w:color="BFBFBF" w:sz="4"/>
+              <w:bottom w:val="single" w:color="BFBFBF" w:sz="4"/>
+              <w:right w:val="single" w:color="BFBFBF" w:sz="4"/>
+            </w:tcBorders>
+            <w:tcMar>
+              <w:top w:type="dxa" w:w="60"/>
+              <w:left w:type="dxa" w:w="100"/>
+              <w:bottom w:type="dxa" w:w="60"/>
+              <w:right w:type="dxa" w:w="100"/>
+            </w:tcMar>
+          </w:tcPr>
+          <w:p>
+            <w:pPr>
+              <w:spacing w:after="0" w:line="260"/>
+            </w:pPr>
+            <w:r>
+              <w:rPr>
+                <w:sz w:val="19"/>
+                <w:szCs w:val="19"/>
+              </w:rPr>
+              <w:t xml:space="preserve">4 703</w:t>
+            </w:r>
+          </w:p>
+        </w:tc>
+        <w:tc>
+          <w:tcPr>
+            <w:tcW w:type="dxa" w:w="2347"/>
+            <w:tcBorders>
+              <w:top w:val="single" w:color="BFBFBF" w:sz="4"/>
+              <w:left w:val="single" w:color="BFBFBF" w:sz="4"/>
+              <w:bottom w:val="single" w:color="BFBFBF" w:sz="4"/>
+              <w:right w:val="single" w:color="BFBFBF" w:sz="4"/>
+            </w:tcBorders>
+            <w:tcMar>
+              <w:top w:type="dxa" w:w="60"/>
+              <w:left w:type="dxa" w:w="100"/>
+              <w:bottom w:type="dxa" w:w="60"/>
+              <w:right w:type="dxa" w:w="100"/>
+            </w:tcMar>
+          </w:tcPr>
+          <w:p>
+            <w:pPr>
+              <w:spacing w:after="0" w:line="260"/>
+            </w:pPr>
+            <w:r>
+              <w:rPr>
+                <w:sz w:val="19"/>
+                <w:szCs w:val="19"/>
+              </w:rPr>
+              <w:t xml:space="preserve">référence</w:t>
+            </w:r>
+          </w:p>
+        </w:tc>
+      </w:tr>
+      <w:tr>
+        <w:tc>
+          <w:tcPr>
+            <w:tcW w:type="dxa" w:w="5235"/>
+            <w:tcBorders>
+              <w:top w:val="single" w:color="BFBFBF" w:sz="4"/>
+              <w:left w:val="single" w:color="BFBFBF" w:sz="4"/>
+              <w:bottom w:val="single" w:color="BFBFBF" w:sz="4"/>
+              <w:right w:val="single" w:color="BFBFBF" w:sz="4"/>
+            </w:tcBorders>
+            <w:tcMar>
+              <w:top w:type="dxa" w:w="60"/>
+              <w:left w:type="dxa" w:w="100"/>
+              <w:bottom w:type="dxa" w:w="60"/>
+              <w:right w:type="dxa" w:w="100"/>
+            </w:tcMar>
+          </w:tcPr>
+          <w:p>
+            <w:pPr>
+              <w:spacing w:after="0" w:line="260"/>
+            </w:pPr>
+            <w:r>
+              <w:rPr>
+                <w:sz w:val="19"/>
+                <w:szCs w:val="19"/>
+              </w:rPr>
+              <w:t xml:space="preserve">Version 7.6 : deux appels (cas de la mesure à 228 s)</w:t>
+            </w:r>
+          </w:p>
+        </w:tc>
+        <w:tc>
+          <w:tcPr>
+            <w:tcW w:type="dxa" w:w="1444"/>
+            <w:tcBorders>
+              <w:top w:val="single" w:color="BFBFBF" w:sz="4"/>
+              <w:left w:val="single" w:color="BFBFBF" w:sz="4"/>
+              <w:bottom w:val="single" w:color="BFBFBF" w:sz="4"/>
+              <w:right w:val="single" w:color="BFBFBF" w:sz="4"/>
+            </w:tcBorders>
+            <w:tcMar>
+              <w:top w:type="dxa" w:w="60"/>
+              <w:left w:type="dxa" w:w="100"/>
+              <w:bottom w:type="dxa" w:w="60"/>
+              <w:right w:type="dxa" w:w="100"/>
+            </w:tcMar>
+          </w:tcPr>
+          <w:p>
+            <w:pPr>
+              <w:spacing w:after="0" w:line="260"/>
+            </w:pPr>
+            <w:r>
+              <w:rPr>
+                <w:sz w:val="19"/>
+                <w:szCs w:val="19"/>
+              </w:rPr>
+              <w:t xml:space="preserve">≈ 9 400</w:t>
+            </w:r>
+          </w:p>
+        </w:tc>
+        <w:tc>
+          <w:tcPr>
+            <w:tcW w:type="dxa" w:w="2347"/>
+            <w:tcBorders>
+              <w:top w:val="single" w:color="BFBFBF" w:sz="4"/>
+              <w:left w:val="single" w:color="BFBFBF" w:sz="4"/>
+              <w:bottom w:val="single" w:color="BFBFBF" w:sz="4"/>
+              <w:right w:val="single" w:color="BFBFBF" w:sz="4"/>
+            </w:tcBorders>
+            <w:tcMar>
+              <w:top w:type="dxa" w:w="60"/>
+              <w:left w:type="dxa" w:w="100"/>
+              <w:bottom w:type="dxa" w:w="60"/>
+              <w:right w:type="dxa" w:w="100"/>
+            </w:tcMar>
+          </w:tcPr>
+          <w:p>
+            <w:pPr>
+              <w:spacing w:after="0" w:line="260"/>
+            </w:pPr>
+          </w:p>
+        </w:tc>
+      </w:tr>
+      <w:tr>
+        <w:tc>
+          <w:tcPr>
+            <w:tcW w:type="dxa" w:w="5235"/>
+            <w:tcBorders>
+              <w:top w:val="single" w:color="BFBFBF" w:sz="4"/>
+              <w:left w:val="single" w:color="BFBFBF" w:sz="4"/>
+              <w:bottom w:val="single" w:color="BFBFBF" w:sz="4"/>
+              <w:right w:val="single" w:color="BFBFBF" w:sz="4"/>
+            </w:tcBorders>
+            <w:tcMar>
+              <w:top w:type="dxa" w:w="60"/>
+              <w:left w:type="dxa" w:w="100"/>
+              <w:bottom w:type="dxa" w:w="60"/>
+              <w:right w:type="dxa" w:w="100"/>
+            </w:tcMar>
+          </w:tcPr>
+          <w:p>
+            <w:pPr>
+              <w:spacing w:after="0" w:line="260"/>
+            </w:pPr>
+            <w:r>
+              <w:rPr>
+                <w:sz w:val="19"/>
+                <w:szCs w:val="19"/>
+              </w:rPr>
+              <w:t xml:space="preserve">Version 19 : étape 1 seule (réponse trouvée en top-1)</w:t>
+            </w:r>
+          </w:p>
+        </w:tc>
+        <w:tc>
+          <w:tcPr>
+            <w:tcW w:type="dxa" w:w="1444"/>
+            <w:tcBorders>
+              <w:top w:val="single" w:color="BFBFBF" w:sz="4"/>
+              <w:left w:val="single" w:color="BFBFBF" w:sz="4"/>
+              <w:bottom w:val="single" w:color="BFBFBF" w:sz="4"/>
+              <w:right w:val="single" w:color="BFBFBF" w:sz="4"/>
+            </w:tcBorders>
+            <w:tcMar>
+              <w:top w:type="dxa" w:w="60"/>
+              <w:left w:type="dxa" w:w="100"/>
+              <w:bottom w:type="dxa" w:w="60"/>
+              <w:right w:type="dxa" w:w="100"/>
+            </w:tcMar>
+          </w:tcPr>
+          <w:p>
+            <w:pPr>
+              <w:spacing w:after="0" w:line="260"/>
+            </w:pPr>
+            <w:r>
+              <w:rPr>
+                <w:sz w:val="19"/>
+                <w:szCs w:val="19"/>
+              </w:rPr>
+              <w:t xml:space="preserve">1 672</w:t>
+            </w:r>
+          </w:p>
+        </w:tc>
+        <w:tc>
+          <w:tcPr>
+            <w:tcW w:type="dxa" w:w="2347"/>
+            <w:tcBorders>
+              <w:top w:val="single" w:color="BFBFBF" w:sz="4"/>
+              <w:left w:val="single" w:color="BFBFBF" w:sz="4"/>
+              <w:bottom w:val="single" w:color="BFBFBF" w:sz="4"/>
+              <w:right w:val="single" w:color="BFBFBF" w:sz="4"/>
+            </w:tcBorders>
+            <w:tcMar>
+              <w:top w:type="dxa" w:w="60"/>
+              <w:left w:type="dxa" w:w="100"/>
+              <w:bottom w:type="dxa" w:w="60"/>
+              <w:right w:type="dxa" w:w="100"/>
+            </w:tcMar>
+          </w:tcPr>
+          <w:p>
+            <w:pPr>
+              <w:spacing w:after="0" w:line="260"/>
+            </w:pPr>
+            <w:r>
+              <w:rPr>
+                <w:sz w:val="19"/>
+                <w:szCs w:val="19"/>
+              </w:rPr>
+              <w:t xml:space="preserve">− 64 % par rapport à un appel</w:t>
+            </w:r>
+          </w:p>
+        </w:tc>
+      </w:tr>
+      <w:tr>
+        <w:tc>
+          <w:tcPr>
+            <w:tcW w:type="dxa" w:w="5235"/>
+            <w:tcBorders>
+              <w:top w:val="single" w:color="BFBFBF" w:sz="4"/>
+              <w:left w:val="single" w:color="BFBFBF" w:sz="4"/>
+              <w:bottom w:val="single" w:color="BFBFBF" w:sz="4"/>
+              <w:right w:val="single" w:color="BFBFBF" w:sz="4"/>
+            </w:tcBorders>
+            <w:tcMar>
+              <w:top w:type="dxa" w:w="60"/>
+              <w:left w:type="dxa" w:w="100"/>
+              <w:bottom w:type="dxa" w:w="60"/>
+              <w:right w:type="dxa" w:w="100"/>
+            </w:tcMar>
+          </w:tcPr>
+          <w:p>
+            <w:pPr>
+              <w:spacing w:after="0" w:line="260"/>
+            </w:pPr>
+            <w:r>
+              <w:rPr>
+                <w:sz w:val="19"/>
+                <w:szCs w:val="19"/>
+              </w:rPr>
+              <w:t xml:space="preserve">Version 19 : étapes 1 et 2 (pire cas)</w:t>
+            </w:r>
+          </w:p>
+        </w:tc>
+        <w:tc>
+          <w:tcPr>
+            <w:tcW w:type="dxa" w:w="1444"/>
+            <w:tcBorders>
+              <w:top w:val="single" w:color="BFBFBF" w:sz="4"/>
+              <w:left w:val="single" w:color="BFBFBF" w:sz="4"/>
+              <w:bottom w:val="single" w:color="BFBFBF" w:sz="4"/>
+              <w:right w:val="single" w:color="BFBFBF" w:sz="4"/>
+            </w:tcBorders>
+            <w:tcMar>
+              <w:top w:type="dxa" w:w="60"/>
+              <w:left w:type="dxa" w:w="100"/>
+              <w:bottom w:type="dxa" w:w="60"/>
+              <w:right w:type="dxa" w:w="100"/>
+            </w:tcMar>
+          </w:tcPr>
+          <w:p>
+            <w:pPr>
+              <w:spacing w:after="0" w:line="260"/>
+            </w:pPr>
+            <w:r>
+              <w:rPr>
+                <w:sz w:val="19"/>
+                <w:szCs w:val="19"/>
+              </w:rPr>
+              <w:t xml:space="preserve">4 651</w:t>
+            </w:r>
+          </w:p>
+        </w:tc>
+        <w:tc>
+          <w:tcPr>
+            <w:tcW w:type="dxa" w:w="2347"/>
+            <w:tcBorders>
+              <w:top w:val="single" w:color="BFBFBF" w:sz="4"/>
+              <w:left w:val="single" w:color="BFBFBF" w:sz="4"/>
+              <w:bottom w:val="single" w:color="BFBFBF" w:sz="4"/>
+              <w:right w:val="single" w:color="BFBFBF" w:sz="4"/>
+            </w:tcBorders>
+            <w:tcMar>
+              <w:top w:type="dxa" w:w="60"/>
+              <w:left w:type="dxa" w:w="100"/>
+              <w:bottom w:type="dxa" w:w="60"/>
+              <w:right w:type="dxa" w:w="100"/>
+            </w:tcMar>
+          </w:tcPr>
+          <w:p>
+            <w:pPr>
+              <w:spacing w:after="0" w:line="260"/>
+            </w:pPr>
+            <w:r>
+              <w:rPr>
+                <w:sz w:val="19"/>
+                <w:szCs w:val="19"/>
+              </w:rPr>
+              <w:t xml:space="preserve">− 50 % par rapport à deux appels</w:t>
+            </w:r>
+          </w:p>
+        </w:tc>
+      </w:tr>
+    </w:tbl>
+    <w:p>
+      <w:pPr>
+        <w:spacing w:after="200" w:before="60"/>
+        <w:jc w:val="center"/>
+      </w:pPr>
+      <w:r>
+        <w:rPr>
+          <w:i/>
+          <w:iCs/>
+          <w:color w:val="595959"/>
+          <w:sz w:val="19"/>
+          <w:szCs w:val="19"/>
+        </w:rPr>
+        <w:t xml:space="preserve">Tableau 4c — Réduction du texte transmis au modèle</w:t>
+      </w:r>
+    </w:p>
+    <w:p>
+      <w:pPr>
+        <w:spacing w:after="120" w:line="288"/>
+        <w:jc w:val="both"/>
+      </w:pPr>
+      <w:r>
+        <w:t xml:space="preserve">D’autres réglages complètent la boucle : réponse bornée (</w:t>
+      </w:r>
+      <w:r>
+        <w:rPr>
+          <w:rFonts w:ascii="Consolas" w:cs="Consolas" w:eastAsia="Consolas" w:hAnsi="Consolas"/>
+          <w:sz w:val="19"/>
+          <w:szCs w:val="19"/>
+        </w:rPr>
+        <w:t xml:space="preserve">num_predict = 350</w:t>
+      </w:r>
+      <w:r>
+        <w:t xml:space="preserve"> jetons, réponse en trois phrases au plus), fenêtre de contexte réduite à 2 048 jetons (</w:t>
+      </w:r>
+      <w:r>
+        <w:rPr>
+          <w:rFonts w:ascii="Consolas" w:cs="Consolas" w:eastAsia="Consolas" w:hAnsi="Consolas"/>
+          <w:sz w:val="19"/>
+          <w:szCs w:val="19"/>
+        </w:rPr>
+        <w:t xml:space="preserve">num_ctx</w:t>
+      </w:r>
+      <w:r>
+        <w:t xml:space="preserve">), modèle maintenu en mémoire 30 minutes (</w:t>
+      </w:r>
+      <w:r>
+        <w:rPr>
+          <w:rFonts w:ascii="Consolas" w:cs="Consolas" w:eastAsia="Consolas" w:hAnsi="Consolas"/>
+          <w:sz w:val="19"/>
+          <w:szCs w:val="19"/>
+        </w:rPr>
+        <w:t xml:space="preserve">keep_alive</w:t>
+      </w:r>
+      <w:r>
+        <w:t xml:space="preserve">) et préchargé au démarrage du conteneur. Le passage à TF-IDF (version 7.6) avait déjà supprimé le CrossEncoder, qui coûtait environ 4 secondes par question.</w:t>
+      </w:r>
+    </w:p>
+    <w:p>
+      <w:pPr>
+        <w:pBdr>
+          <w:left w:val="single" w:color="2E75B6" w:sz="18" w:space="8"/>
+        </w:pBdr>
+        <w:shd w:fill="DEEAF6" w:color="auto" w:val="clear"/>
+        <w:spacing w:after="160" w:before="80" w:line="276"/>
+        <w:ind w:left="200" w:right="200"/>
+      </w:pPr>
+      <w:r>
+        <w:t xml:space="preserve">Ces gains sont </w:t>
+      </w:r>
       <w:r>
         <w:rPr>
           <w:b/>
           <w:bCs/>
         </w:rPr>
-        <w:t xml:space="preserve">Préchargement au démarrage</w:t>
-      </w:r>
-      <w:r>
-        <w:t xml:space="preserve"> : le conteneur charge le modèle dès qu’il est téléchargé, si bien que la première question ne subit pas ce temps de chargement.</w:t>
-      </w:r>
-    </w:p>
-    <w:p>
-      <w:pPr>
-        <w:pStyle w:val="ListParagraph"/>
-        <w:numPr>
-          <w:ilvl w:val="0"/>
-          <w:numId w:val="3"/>
-        </w:numPr>
-        <w:spacing w:after="60" w:line="276"/>
-      </w:pPr>
-      <w:r>
-        <w:rPr>
-          <w:b/>
-          <w:bCs/>
-        </w:rPr>
-        <w:t xml:space="preserve">Recherche légère</w:t>
-      </w:r>
-      <w:r>
-        <w:t xml:space="preserve"> : le passage à TF-IDF (version 7.6) a supprimé le CrossEncoder, dont le reclassement coûtait environ 4 secondes par question.</w:t>
-      </w:r>
-    </w:p>
-    <w:p>
-      <w:pPr>
-        <w:spacing w:after="120" w:line="288"/>
-        <w:jc w:val="both"/>
-      </w:pPr>
-      <w:r>
-        <w:t xml:space="preserve">Ces réglages sont configurables par variables d’environnement. Leur gain n’a pas encore été chronométré sur le Space : la mesure est prévue dans la campagne de recette (section 10). L’interface affiche les durées de chaque étape pour chaque question, ce qui permet de la réaliser simplement.</w:t>
+        <w:t xml:space="preserve">estimés</w:t>
+      </w:r>
+      <w:r>
+        <w:t xml:space="preserve"> à partir de la quantité de texte lue par le modèle ; ils n’ont pas encore été chronométrés sur le Space. L’interface affiche, pour chaque question, la durée de génération, le nombre d’appels et le nombre de sources lues, ce qui permet de les mesurer directement. Si le temps reste trop long, le modèle peut être remplacé par une version plus petite (</w:t>
+      </w:r>
+      <w:r>
+        <w:rPr>
+          <w:rFonts w:ascii="Consolas" w:cs="Consolas" w:eastAsia="Consolas" w:hAnsi="Consolas"/>
+          <w:sz w:val="19"/>
+          <w:szCs w:val="19"/>
+        </w:rPr>
+        <w:t xml:space="preserve">OLLAMA_MODEL=llama3.2:1b</w:t>
+      </w:r>
+      <w:r>
+        <w:t xml:space="preserve">) sans modifier le code, au prix d’une qualité de rédaction moindre.</w:t>
       </w:r>
     </w:p>
     <w:p>
@@ -9025,7 +9587,7 @@
                 <w:sz w:val="19"/>
                 <w:szCs w:val="19"/>
               </w:rPr>
-              <w:t xml:space="preserve">40 % de Recall@5 sur les reformulations ; réponses non typées</w:t>
+              <w:t xml:space="preserve">40 % de Recall@5 sur les reformulations ; réponses non typées ; 228 s de génération sur le Space</w:t>
             </w:r>
           </w:p>
         </w:tc>
@@ -9054,7 +9616,7 @@
                 <w:sz w:val="19"/>
                 <w:szCs w:val="19"/>
               </w:rPr>
-              <w:t xml:space="preserve">synonymes métier, réponse typée et vérifiée</w:t>
+              <w:t xml:space="preserve">synonymes métier, réponse typée et vérifiée, boucle top-1 puis top-3</w:t>
             </w:r>
           </w:p>
         </w:tc>
@@ -9083,7 +9645,7 @@
                 <w:sz w:val="19"/>
                 <w:szCs w:val="19"/>
               </w:rPr>
-              <w:t xml:space="preserve">101 tests ; jeu tenu à part : 36,7 % → 46,7 %</w:t>
+              <w:t xml:space="preserve">104 tests ; jeu tenu à part : 36,7 % → 46,7 % ; texte lu − 50 à − 64 %</w:t>
             </w:r>
           </w:p>
         </w:tc>
@@ -10020,7 +10582,7 @@
         <w:pStyle w:val="ListParagraph"/>
         <w:numPr>
           <w:ilvl w:val="0"/>
-          <w:numId w:val="3"/>
+          <w:numId w:val="4"/>
         </w:numPr>
         <w:spacing w:after="60" w:line="276"/>
       </w:pPr>
@@ -10040,7 +10602,7 @@
         <w:pStyle w:val="ListParagraph"/>
         <w:numPr>
           <w:ilvl w:val="0"/>
-          <w:numId w:val="3"/>
+          <w:numId w:val="4"/>
         </w:numPr>
         <w:spacing w:after="60" w:line="276"/>
       </w:pPr>
@@ -10083,7 +10645,7 @@
         <w:pStyle w:val="ListParagraph"/>
         <w:numPr>
           <w:ilvl w:val="0"/>
-          <w:numId w:val="3"/>
+          <w:numId w:val="4"/>
         </w:numPr>
         <w:spacing w:after="60" w:line="276"/>
       </w:pPr>
@@ -10103,7 +10665,7 @@
         <w:pStyle w:val="ListParagraph"/>
         <w:numPr>
           <w:ilvl w:val="0"/>
-          <w:numId w:val="3"/>
+          <w:numId w:val="4"/>
         </w:numPr>
         <w:spacing w:after="60" w:line="276"/>
       </w:pPr>
@@ -10133,7 +10695,7 @@
         <w:pStyle w:val="ListParagraph"/>
         <w:numPr>
           <w:ilvl w:val="0"/>
-          <w:numId w:val="3"/>
+          <w:numId w:val="4"/>
         </w:numPr>
         <w:spacing w:after="60" w:line="276"/>
       </w:pPr>
@@ -12921,7 +13483,7 @@
                 <w:sz w:val="19"/>
                 <w:szCs w:val="19"/>
               </w:rPr>
-              <w:t xml:space="preserve">34</w:t>
+              <w:t xml:space="preserve">37</w:t>
             </w:r>
           </w:p>
         </w:tc>
@@ -12950,7 +13512,7 @@
                 <w:sz w:val="19"/>
                 <w:szCs w:val="19"/>
               </w:rPr>
-              <w:t xml:space="preserve">vérification des extraits (exacts, approchés, inventés), JSON invalide, statuts, révision, repli, confiance non décisive, schéma, erreurs Ollama → 502, mode diagnostic</w:t>
+              <w:t xml:space="preserve">vérification des extraits (exacts, approchés, inventés), JSON invalide, statuts, boucle top-1 / top-3, troncature, repli, confiance non décisive, schéma, erreurs Ollama → 502, mode diagnostic</w:t>
             </w:r>
           </w:p>
         </w:tc>
@@ -13329,7 +13891,7 @@
                 <w:sz w:val="19"/>
                 <w:szCs w:val="19"/>
               </w:rPr>
-              <w:t xml:space="preserve">101</w:t>
+              <w:t xml:space="preserve">104</w:t>
             </w:r>
           </w:p>
         </w:tc>
@@ -13411,7 +13973,7 @@
           <w:b/>
           <w:bCs/>
         </w:rPr>
-        <w:t xml:space="preserve">95 tests ont réussi et 6 ont été ignorés</w:t>
+        <w:t xml:space="preserve">98 tests ont réussi et 6 ont été ignorés</w:t>
       </w:r>
       <w:r>
         <w:t xml:space="preserve">. Les 6 tests ignorés sont les tests HTTP de bout en bout, qui nécessitent la bibliothèque </w:t>
@@ -13554,7 +14116,7 @@
         <w:t xml:space="preserve">fallback</w:t>
       </w:r>
       <w:r>
-        <w:t xml:space="preserve">), la fidélité des réponses aux extraits, la pertinence métier des fiches pour des questions réelles, et la latence sur la machine de production. Les tests simulent Ollama : ils prouvent que l’application réagit correctement à chaque type de sortie, pas que le modèle produit de bonnes sorties. Ces points font l’objet de la campagne de recette (section 10).</w:t>
+        <w:t xml:space="preserve">, nombre d’étapes), la fidélité des réponses aux extraits, la pertinence métier des fiches pour des questions réelles, et la latence sur la machine de production. Les tests simulent Ollama : ils prouvent que l’application réagit correctement à chaque type de sortie, pas que le modèle produit de bonnes sorties. Ces points font l’objet de la campagne de recette (section 10).</w:t>
       </w:r>
     </w:p>
     <w:p>
@@ -13601,7 +14163,7 @@
         <w:pStyle w:val="ListParagraph"/>
         <w:numPr>
           <w:ilvl w:val="0"/>
-          <w:numId w:val="4"/>
+          <w:numId w:val="5"/>
         </w:numPr>
         <w:spacing w:after="60" w:line="276"/>
       </w:pPr>
@@ -13614,7 +14176,7 @@
         <w:pStyle w:val="ListParagraph"/>
         <w:numPr>
           <w:ilvl w:val="0"/>
-          <w:numId w:val="4"/>
+          <w:numId w:val="5"/>
         </w:numPr>
         <w:spacing w:after="60" w:line="276"/>
       </w:pPr>
@@ -13638,7 +14200,7 @@
         <w:pStyle w:val="ListParagraph"/>
         <w:numPr>
           <w:ilvl w:val="0"/>
-          <w:numId w:val="4"/>
+          <w:numId w:val="5"/>
         </w:numPr>
         <w:spacing w:after="60" w:line="276"/>
       </w:pPr>
@@ -14101,7 +14663,7 @@
                 <w:sz w:val="19"/>
                 <w:szCs w:val="19"/>
               </w:rPr>
-              <w:t xml:space="preserve">500</w:t>
+              <w:t xml:space="preserve">350</w:t>
             </w:r>
           </w:p>
         </w:tc>
@@ -14131,6 +14693,96 @@
                 <w:szCs w:val="19"/>
               </w:rPr>
               <w:t xml:space="preserve">longueur maximale d’une réponse</w:t>
+            </w:r>
+          </w:p>
+        </w:tc>
+      </w:tr>
+      <w:tr>
+        <w:tc>
+          <w:tcPr>
+            <w:tcW w:type="dxa" w:w="2888"/>
+            <w:tcBorders>
+              <w:top w:val="single" w:color="BFBFBF" w:sz="4"/>
+              <w:left w:val="single" w:color="BFBFBF" w:sz="4"/>
+              <w:bottom w:val="single" w:color="BFBFBF" w:sz="4"/>
+              <w:right w:val="single" w:color="BFBFBF" w:sz="4"/>
+            </w:tcBorders>
+            <w:tcMar>
+              <w:top w:type="dxa" w:w="60"/>
+              <w:left w:type="dxa" w:w="100"/>
+              <w:bottom w:type="dxa" w:w="60"/>
+              <w:right w:type="dxa" w:w="100"/>
+            </w:tcMar>
+          </w:tcPr>
+          <w:p>
+            <w:pPr>
+              <w:spacing w:after="0" w:line="260"/>
+            </w:pPr>
+            <w:r>
+              <w:rPr>
+                <w:rFonts w:ascii="Consolas" w:cs="Consolas" w:eastAsia="Consolas" w:hAnsi="Consolas"/>
+                <w:sz w:val="19"/>
+                <w:szCs w:val="19"/>
+              </w:rPr>
+              <w:t xml:space="preserve">OLLAMA_NUM_CTX</w:t>
+            </w:r>
+          </w:p>
+        </w:tc>
+        <w:tc>
+          <w:tcPr>
+            <w:tcW w:type="dxa" w:w="1985"/>
+            <w:tcBorders>
+              <w:top w:val="single" w:color="BFBFBF" w:sz="4"/>
+              <w:left w:val="single" w:color="BFBFBF" w:sz="4"/>
+              <w:bottom w:val="single" w:color="BFBFBF" w:sz="4"/>
+              <w:right w:val="single" w:color="BFBFBF" w:sz="4"/>
+            </w:tcBorders>
+            <w:tcMar>
+              <w:top w:type="dxa" w:w="60"/>
+              <w:left w:type="dxa" w:w="100"/>
+              <w:bottom w:type="dxa" w:w="60"/>
+              <w:right w:type="dxa" w:w="100"/>
+            </w:tcMar>
+          </w:tcPr>
+          <w:p>
+            <w:pPr>
+              <w:spacing w:after="0" w:line="260"/>
+            </w:pPr>
+            <w:r>
+              <w:rPr>
+                <w:sz w:val="19"/>
+                <w:szCs w:val="19"/>
+              </w:rPr>
+              <w:t xml:space="preserve">2048</w:t>
+            </w:r>
+          </w:p>
+        </w:tc>
+        <w:tc>
+          <w:tcPr>
+            <w:tcW w:type="dxa" w:w="4153"/>
+            <w:tcBorders>
+              <w:top w:val="single" w:color="BFBFBF" w:sz="4"/>
+              <w:left w:val="single" w:color="BFBFBF" w:sz="4"/>
+              <w:bottom w:val="single" w:color="BFBFBF" w:sz="4"/>
+              <w:right w:val="single" w:color="BFBFBF" w:sz="4"/>
+            </w:tcBorders>
+            <w:tcMar>
+              <w:top w:type="dxa" w:w="60"/>
+              <w:left w:type="dxa" w:w="100"/>
+              <w:bottom w:type="dxa" w:w="60"/>
+              <w:right w:type="dxa" w:w="100"/>
+            </w:tcMar>
+          </w:tcPr>
+          <w:p>
+            <w:pPr>
+              <w:spacing w:after="0" w:line="260"/>
+            </w:pPr>
+            <w:r>
+              <w:rPr>
+                <w:sz w:val="19"/>
+                <w:szCs w:val="19"/>
+              </w:rPr>
+              <w:t xml:space="preserve">fenêtre de contexte (plus petite = plus rapide)</w:t>
             </w:r>
           </w:p>
         </w:tc>
@@ -15433,7 +16085,7 @@
         <w:pStyle w:val="ListParagraph"/>
         <w:numPr>
           <w:ilvl w:val="0"/>
-          <w:numId w:val="3"/>
+          <w:numId w:val="4"/>
         </w:numPr>
         <w:spacing w:after="60" w:line="276"/>
       </w:pPr>
@@ -15453,7 +16105,7 @@
         <w:pStyle w:val="ListParagraph"/>
         <w:numPr>
           <w:ilvl w:val="0"/>
-          <w:numId w:val="3"/>
+          <w:numId w:val="4"/>
         </w:numPr>
         <w:spacing w:after="60" w:line="276"/>
       </w:pPr>
@@ -15517,7 +16169,7 @@
         <w:pStyle w:val="ListParagraph"/>
         <w:numPr>
           <w:ilvl w:val="0"/>
-          <w:numId w:val="3"/>
+          <w:numId w:val="4"/>
         </w:numPr>
         <w:spacing w:after="60" w:line="276"/>
       </w:pPr>
@@ -15537,7 +16189,7 @@
         <w:pStyle w:val="ListParagraph"/>
         <w:numPr>
           <w:ilvl w:val="0"/>
-          <w:numId w:val="3"/>
+          <w:numId w:val="4"/>
         </w:numPr>
         <w:spacing w:after="60" w:line="276"/>
       </w:pPr>
@@ -15557,7 +16209,7 @@
         <w:pStyle w:val="ListParagraph"/>
         <w:numPr>
           <w:ilvl w:val="0"/>
-          <w:numId w:val="3"/>
+          <w:numId w:val="4"/>
         </w:numPr>
         <w:spacing w:after="60" w:line="276"/>
       </w:pPr>
@@ -15577,7 +16229,7 @@
         <w:pStyle w:val="ListParagraph"/>
         <w:numPr>
           <w:ilvl w:val="0"/>
-          <w:numId w:val="3"/>
+          <w:numId w:val="4"/>
         </w:numPr>
         <w:spacing w:after="60" w:line="276"/>
       </w:pPr>
@@ -15597,7 +16249,7 @@
         <w:pStyle w:val="ListParagraph"/>
         <w:numPr>
           <w:ilvl w:val="0"/>
-          <w:numId w:val="3"/>
+          <w:numId w:val="4"/>
         </w:numPr>
         <w:spacing w:after="60" w:line="276"/>
       </w:pPr>
@@ -15606,10 +16258,10 @@
           <w:b/>
           <w:bCs/>
         </w:rPr>
-        <w:t xml:space="preserve">k fixe</w:t>
-      </w:r>
-      <w:r>
-        <w:t xml:space="preserve"> : cinq fiches sont toujours transmises, même lorsqu’une seule suffit.</w:t>
+        <w:t xml:space="preserve">Temps de réponse non mesuré après optimisation</w:t>
+      </w:r>
+      <w:r>
+        <w:t xml:space="preserve"> : la réduction du texte lu est calculée, pas encore chronométrée sur le Space.</w:t>
       </w:r>
     </w:p>
     <w:p>
@@ -15625,7 +16277,7 @@
         <w:pStyle w:val="ListParagraph"/>
         <w:numPr>
           <w:ilvl w:val="0"/>
-          <w:numId w:val="5"/>
+          <w:numId w:val="6"/>
         </w:numPr>
         <w:spacing w:after="60" w:line="276"/>
       </w:pPr>
@@ -15634,21 +16286,10 @@
           <w:b/>
           <w:bCs/>
         </w:rPr>
-        <w:t xml:space="preserve">Boucle top-1 puis top-k</w:t>
-      </w:r>
-      <w:r>
-        <w:t xml:space="preserve"> (article 2) : donner d’abord la meilleure fiche seule et s’arrêter si </w:t>
-      </w:r>
-      <w:r>
-        <w:rPr>
-          <w:rFonts w:ascii="Consolas" w:cs="Consolas" w:eastAsia="Consolas" w:hAnsi="Consolas"/>
-          <w:sz w:val="19"/>
-          <w:szCs w:val="19"/>
-        </w:rPr>
-        <w:t xml:space="preserve">complete_answer_found</w:t>
-      </w:r>
-      <w:r>
-        <w:t xml:space="preserve"> est vrai, sinon ajouter la suivante. Les indicateurs typés existent déjà ; ce changement réduirait aussi le temps de génération des questions factuelles.</w:t>
+        <w:t xml:space="preserve">Chronométrer la boucle sur le Space</w:t>
+      </w:r>
+      <w:r>
+        <w:t xml:space="preserve"> et choisir le modèle (3B ou 1B) selon le compromis temps / qualité observé ; distinguer les questions de liste ou de comparaison, qui doivent lire plusieurs sources d’emblée.</w:t>
       </w:r>
     </w:p>
     <w:p>
@@ -15656,7 +16297,7 @@
         <w:pStyle w:val="ListParagraph"/>
         <w:numPr>
           <w:ilvl w:val="0"/>
-          <w:numId w:val="5"/>
+          <w:numId w:val="6"/>
         </w:numPr>
         <w:spacing w:after="60" w:line="276"/>
       </w:pPr>
@@ -15676,7 +16317,7 @@
         <w:pStyle w:val="ListParagraph"/>
         <w:numPr>
           <w:ilvl w:val="0"/>
-          <w:numId w:val="5"/>
+          <w:numId w:val="6"/>
         </w:numPr>
         <w:spacing w:after="60" w:line="276"/>
       </w:pPr>
@@ -15696,7 +16337,7 @@
         <w:pStyle w:val="ListParagraph"/>
         <w:numPr>
           <w:ilvl w:val="0"/>
-          <w:numId w:val="5"/>
+          <w:numId w:val="6"/>
         </w:numPr>
         <w:spacing w:after="60" w:line="276"/>
       </w:pPr>
@@ -15716,7 +16357,7 @@
         <w:pStyle w:val="ListParagraph"/>
         <w:numPr>
           <w:ilvl w:val="0"/>
-          <w:numId w:val="5"/>
+          <w:numId w:val="6"/>
         </w:numPr>
         <w:spacing w:after="60" w:line="276"/>
       </w:pPr>
@@ -15736,7 +16377,7 @@
         <w:pStyle w:val="ListParagraph"/>
         <w:numPr>
           <w:ilvl w:val="0"/>
-          <w:numId w:val="5"/>
+          <w:numId w:val="6"/>
         </w:numPr>
         <w:spacing w:after="60" w:line="276"/>
       </w:pPr>
@@ -15766,7 +16407,7 @@
         <w:jc w:val="both"/>
       </w:pPr>
       <w:r>
-        <w:t xml:space="preserve">Insurance Claims Assistance réunit trois compétences complémentaires : la recherche d’information, l’usage contrôlé d’un modèle de langage et l’apprentissage supervisé. L’application est en ligne, vérifiable en une dizaine de minutes, et protégée par 101 tests qui conditionnent son déploiement. Ses réponses sont typées, et chaque extrait affiché a été retrouvé par l’application dans la source citée.</w:t>
+        <w:t xml:space="preserve">Insurance Claims Assistance réunit trois compétences complémentaires : la recherche d’information, l’usage contrôlé d’un modèle de langage et l’apprentissage supervisé. L’application est en ligne, vérifiable en une dizaine de minutes, et protégée par 104 tests qui conditionnent son déploiement. Ses réponses sont typées, et chaque extrait affiché a été retrouvé par l’application dans la source citée.</w:t>
       </w:r>
     </w:p>
     <w:p>
@@ -15942,7 +16583,7 @@
           <w:sz w:val="18"/>
           <w:szCs w:val="18"/>
         </w:rPr>
-        <w:t xml:space="preserve">├── tests/                101 tests pytest</w:t>
+        <w:t xml:space="preserve">├── tests/                104 tests pytest</w:t>
       </w:r>
     </w:p>
     <w:p>
@@ -17348,18 +17989,24 @@
     </w:lvlOverride>
   </w:num>
   <w:num w:numId="3">
+    <w:abstractNumId w:val="4"/>
+    <w:lvlOverride w:ilvl="0">
+      <w:startOverride w:val="1"/>
+    </w:lvlOverride>
+  </w:num>
+  <w:num w:numId="4">
     <w:abstractNumId w:val="2"/>
     <w:lvlOverride w:ilvl="0">
       <w:startOverride w:val="1"/>
     </w:lvlOverride>
   </w:num>
-  <w:num w:numId="4">
+  <w:num w:numId="5">
     <w:abstractNumId w:val="5"/>
     <w:lvlOverride w:ilvl="0">
       <w:startOverride w:val="1"/>
     </w:lvlOverride>
   </w:num>
-  <w:num w:numId="5">
+  <w:num w:numId="6">
     <w:abstractNumId w:val="6"/>
     <w:lvlOverride w:ilvl="0">
       <w:startOverride w:val="1"/>

</xml_diff>

<commit_message>
Aide à la décision sur un dossier : score expliqué, règles métier, clauses du contrat
- src/claim_decision.py et GET /api/claims/{id}/decision-support
- contributions de la régression logistique par facteur
- règles explicites : dossier incomplet, garantie à vérifier, montant au-delà
  du 90e centile, historique chargé, Pending de plus de 30 ou 90 jours
- clauses par type de sinistre (table validable par un expert) et
  signalement des trous du corpus (incendie, bris de glace)
- orientation pour le gestionnaire ; chaque clause ouvre l'assistant RAG
- l'audit des citations porte sur les sources lues par le modèle
- rapport : section 5.6 et figure de la vue d'aide à la décision
</commit_message>
<xml_diff>
--- a/docs/rapport/Rapport_Insurance_Claims_Assistance_v19.docx
+++ b/docs/rapport/Rapport_Insurance_Claims_Assistance_v19.docx
@@ -264,17 +264,17 @@
         <w:t xml:space="preserve">vérifie elle-même</w:t>
       </w:r>
       <w:r>
-        <w:t xml:space="preserve"> chaque extrait dans la source citée avant d’afficher la réponse. La seconde est un </w:t>
+        <w:t xml:space="preserve"> chaque extrait dans la source citée avant d’afficher la réponse. La seconde est une </w:t>
       </w:r>
       <w:r>
         <w:rPr>
           <w:b/>
           <w:bCs/>
         </w:rPr>
-        <w:t xml:space="preserve">tableau de bord de sinistres</w:t>
-      </w:r>
-      <w:r>
-        <w:t xml:space="preserve"> construit sur 120 dossiers fictifs : indicateurs descriptifs et régression logistique estimant une probabilité indicative d’acceptation.</w:t>
+        <w:t xml:space="preserve">aide à la décision sur un dossier de sinistre</w:t>
+      </w:r>
+      <w:r>
+        <w:t xml:space="preserve"> (120 dossiers fictifs) : pour un dossier, l’application réunit le score expliqué par une régression logistique, les points à vérifier selon des règles métier explicites, les clauses du contrat correspondant au type de sinistre, et une orientation pour le gestionnaire.</w:t>
       </w:r>
     </w:p>
     <w:p>
@@ -313,14 +313,14 @@
         <w:t xml:space="preserve">boucle top-1 puis top-3</w:t>
       </w:r>
       <w:r>
-        <w:t xml:space="preserve"> qui réduit de moitié à deux tiers le texte lu par le modèle, image Docker allégée, suite de </w:t>
+        <w:t xml:space="preserve"> qui réduit de moitié à deux tiers le texte lu par le modèle, image Docker allégée, aide à la décision reliant le score et le contrat, suite de </w:t>
       </w:r>
       <w:r>
         <w:rPr>
           <w:b/>
           <w:bCs/>
         </w:rPr>
-        <w:t xml:space="preserve">104 tests automatisés</w:t>
+        <w:t xml:space="preserve">125 tests automatisés</w:t>
       </w:r>
       <w:r>
         <w:t xml:space="preserve">, évaluation reproductible et déploiement conditionné à la réussite des tests.</w:t>
@@ -829,6 +829,95 @@
                 <w:sz w:val="19"/>
                 <w:szCs w:val="19"/>
               </w:rPr>
+              <w:t xml:space="preserve">Orientations proposées sur 120 dossiers</w:t>
+            </w:r>
+          </w:p>
+        </w:tc>
+        <w:tc>
+          <w:tcPr>
+            <w:tcW w:type="dxa" w:w="1263"/>
+            <w:tcBorders>
+              <w:top w:val="single" w:color="BFBFBF" w:sz="4"/>
+              <w:left w:val="single" w:color="BFBFBF" w:sz="4"/>
+              <w:bottom w:val="single" w:color="BFBFBF" w:sz="4"/>
+              <w:right w:val="single" w:color="BFBFBF" w:sz="4"/>
+            </w:tcBorders>
+            <w:tcMar>
+              <w:top w:type="dxa" w:w="60"/>
+              <w:left w:type="dxa" w:w="100"/>
+              <w:bottom w:type="dxa" w:w="60"/>
+              <w:right w:type="dxa" w:w="100"/>
+            </w:tcMar>
+          </w:tcPr>
+          <w:p>
+            <w:pPr>
+              <w:spacing w:after="0" w:line="260"/>
+            </w:pPr>
+            <w:r>
+              <w:rPr>
+                <w:sz w:val="19"/>
+                <w:szCs w:val="19"/>
+              </w:rPr>
+              <w:t xml:space="preserve">36 / 32 / 26 / 17 / 9</w:t>
+            </w:r>
+          </w:p>
+        </w:tc>
+        <w:tc>
+          <w:tcPr>
+            <w:tcW w:type="dxa" w:w="4334"/>
+            <w:tcBorders>
+              <w:top w:val="single" w:color="BFBFBF" w:sz="4"/>
+              <w:left w:val="single" w:color="BFBFBF" w:sz="4"/>
+              <w:bottom w:val="single" w:color="BFBFBF" w:sz="4"/>
+              <w:right w:val="single" w:color="BFBFBF" w:sz="4"/>
+            </w:tcBorders>
+            <w:tcMar>
+              <w:top w:type="dxa" w:w="60"/>
+              <w:left w:type="dxa" w:w="100"/>
+              <w:bottom w:type="dxa" w:w="60"/>
+              <w:right w:type="dxa" w:w="100"/>
+            </w:tcMar>
+          </w:tcPr>
+          <w:p>
+            <w:pPr>
+              <w:spacing w:after="0" w:line="260"/>
+            </w:pPr>
+            <w:r>
+              <w:rPr>
+                <w:sz w:val="19"/>
+                <w:szCs w:val="19"/>
+              </w:rPr>
+              <w:t xml:space="preserve">compléter / vérifier le contrat / approfondir / favorable / défavorable</w:t>
+            </w:r>
+          </w:p>
+        </w:tc>
+      </w:tr>
+      <w:tr>
+        <w:tc>
+          <w:tcPr>
+            <w:tcW w:type="dxa" w:w="3429"/>
+            <w:tcBorders>
+              <w:top w:val="single" w:color="BFBFBF" w:sz="4"/>
+              <w:left w:val="single" w:color="BFBFBF" w:sz="4"/>
+              <w:bottom w:val="single" w:color="BFBFBF" w:sz="4"/>
+              <w:right w:val="single" w:color="BFBFBF" w:sz="4"/>
+            </w:tcBorders>
+            <w:tcMar>
+              <w:top w:type="dxa" w:w="60"/>
+              <w:left w:type="dxa" w:w="100"/>
+              <w:bottom w:type="dxa" w:w="60"/>
+              <w:right w:type="dxa" w:w="100"/>
+            </w:tcMar>
+          </w:tcPr>
+          <w:p>
+            <w:pPr>
+              <w:spacing w:after="0" w:line="260"/>
+            </w:pPr>
+            <w:r>
+              <w:rPr>
+                <w:sz w:val="19"/>
+                <w:szCs w:val="19"/>
+              </w:rPr>
               <w:t xml:space="preserve">Tests automatisés</w:t>
             </w:r>
           </w:p>
@@ -858,7 +947,7 @@
                 <w:sz w:val="19"/>
                 <w:szCs w:val="19"/>
               </w:rPr>
-              <w:t xml:space="preserve">104</w:t>
+              <w:t xml:space="preserve">125</w:t>
             </w:r>
           </w:p>
         </w:tc>
@@ -887,7 +976,7 @@
                 <w:sz w:val="19"/>
                 <w:szCs w:val="19"/>
               </w:rPr>
-              <w:t xml:space="preserve">98 exécutés localement + 6 tests HTTP exécutés en intégration continue</w:t>
+              <w:t xml:space="preserve">119 exécutés localement + 6 tests HTTP exécutés en intégration continue</w:t>
             </w:r>
           </w:p>
         </w:tc>
@@ -1758,6 +1847,95 @@
                 <w:sz w:val="19"/>
                 <w:szCs w:val="19"/>
               </w:rPr>
+              <w:t xml:space="preserve">« Montrez ce que votre résultat permet de décider »</w:t>
+            </w:r>
+          </w:p>
+        </w:tc>
+        <w:tc>
+          <w:tcPr>
+            <w:tcW w:type="dxa" w:w="3971"/>
+            <w:tcBorders>
+              <w:top w:val="single" w:color="BFBFBF" w:sz="4"/>
+              <w:left w:val="single" w:color="BFBFBF" w:sz="4"/>
+              <w:bottom w:val="single" w:color="BFBFBF" w:sz="4"/>
+              <w:right w:val="single" w:color="BFBFBF" w:sz="4"/>
+            </w:tcBorders>
+            <w:tcMar>
+              <w:top w:type="dxa" w:w="60"/>
+              <w:left w:type="dxa" w:w="100"/>
+              <w:bottom w:type="dxa" w:w="60"/>
+              <w:right w:type="dxa" w:w="100"/>
+            </w:tcMar>
+          </w:tcPr>
+          <w:p>
+            <w:pPr>
+              <w:spacing w:after="0" w:line="260"/>
+            </w:pPr>
+            <w:r>
+              <w:rPr>
+                <w:sz w:val="19"/>
+                <w:szCs w:val="19"/>
+              </w:rPr>
+              <w:t xml:space="preserve">aide à la décision par dossier : score expliqué, points à vérifier, clauses, orientation (§ 5.6)</w:t>
+            </w:r>
+          </w:p>
+        </w:tc>
+        <w:tc>
+          <w:tcPr>
+            <w:tcW w:type="dxa" w:w="1626"/>
+            <w:tcBorders>
+              <w:top w:val="single" w:color="BFBFBF" w:sz="4"/>
+              <w:left w:val="single" w:color="BFBFBF" w:sz="4"/>
+              <w:bottom w:val="single" w:color="BFBFBF" w:sz="4"/>
+              <w:right w:val="single" w:color="BFBFBF" w:sz="4"/>
+            </w:tcBorders>
+            <w:tcMar>
+              <w:top w:type="dxa" w:w="60"/>
+              <w:left w:type="dxa" w:w="100"/>
+              <w:bottom w:type="dxa" w:w="60"/>
+              <w:right w:type="dxa" w:w="100"/>
+            </w:tcMar>
+          </w:tcPr>
+          <w:p>
+            <w:pPr>
+              <w:spacing w:after="0" w:line="260"/>
+            </w:pPr>
+            <w:r>
+              <w:rPr>
+                <w:sz w:val="19"/>
+                <w:szCs w:val="19"/>
+              </w:rPr>
+              <w:t xml:space="preserve">fait</w:t>
+            </w:r>
+          </w:p>
+        </w:tc>
+      </w:tr>
+      <w:tr>
+        <w:tc>
+          <w:tcPr>
+            <w:tcW w:type="dxa" w:w="3429"/>
+            <w:tcBorders>
+              <w:top w:val="single" w:color="BFBFBF" w:sz="4"/>
+              <w:left w:val="single" w:color="BFBFBF" w:sz="4"/>
+              <w:bottom w:val="single" w:color="BFBFBF" w:sz="4"/>
+              <w:right w:val="single" w:color="BFBFBF" w:sz="4"/>
+            </w:tcBorders>
+            <w:tcMar>
+              <w:top w:type="dxa" w:w="60"/>
+              <w:left w:type="dxa" w:w="100"/>
+              <w:bottom w:type="dxa" w:w="60"/>
+              <w:right w:type="dxa" w:w="100"/>
+            </w:tcMar>
+          </w:tcPr>
+          <w:p>
+            <w:pPr>
+              <w:spacing w:after="0" w:line="260"/>
+            </w:pPr>
+            <w:r>
+              <w:rPr>
+                <w:sz w:val="19"/>
+                <w:szCs w:val="19"/>
+              </w:rPr>
               <w:t xml:space="preserve">Citation à la page et à la ligne de PDF hétérogènes</w:t>
             </w:r>
           </w:p>
@@ -3059,6 +3237,96 @@
                 <w:sz w:val="19"/>
                 <w:szCs w:val="19"/>
               </w:rPr>
+              <w:t xml:space="preserve">Aide à la décision</w:t>
+            </w:r>
+          </w:p>
+        </w:tc>
+        <w:tc>
+          <w:tcPr>
+            <w:tcW w:type="dxa" w:w="2707"/>
+            <w:tcBorders>
+              <w:top w:val="single" w:color="BFBFBF" w:sz="4"/>
+              <w:left w:val="single" w:color="BFBFBF" w:sz="4"/>
+              <w:bottom w:val="single" w:color="BFBFBF" w:sz="4"/>
+              <w:right w:val="single" w:color="BFBFBF" w:sz="4"/>
+            </w:tcBorders>
+            <w:tcMar>
+              <w:top w:type="dxa" w:w="60"/>
+              <w:left w:type="dxa" w:w="100"/>
+              <w:bottom w:type="dxa" w:w="60"/>
+              <w:right w:type="dxa" w:w="100"/>
+            </w:tcMar>
+          </w:tcPr>
+          <w:p>
+            <w:pPr>
+              <w:spacing w:after="0" w:line="260"/>
+            </w:pPr>
+            <w:r>
+              <w:rPr>
+                <w:rFonts w:ascii="Consolas" w:cs="Consolas" w:eastAsia="Consolas" w:hAnsi="Consolas"/>
+                <w:sz w:val="19"/>
+                <w:szCs w:val="19"/>
+              </w:rPr>
+              <w:t xml:space="preserve">src/claim_decision.py</w:t>
+            </w:r>
+          </w:p>
+        </w:tc>
+        <w:tc>
+          <w:tcPr>
+            <w:tcW w:type="dxa" w:w="4153"/>
+            <w:tcBorders>
+              <w:top w:val="single" w:color="BFBFBF" w:sz="4"/>
+              <w:left w:val="single" w:color="BFBFBF" w:sz="4"/>
+              <w:bottom w:val="single" w:color="BFBFBF" w:sz="4"/>
+              <w:right w:val="single" w:color="BFBFBF" w:sz="4"/>
+            </w:tcBorders>
+            <w:tcMar>
+              <w:top w:type="dxa" w:w="60"/>
+              <w:left w:type="dxa" w:w="100"/>
+              <w:bottom w:type="dxa" w:w="60"/>
+              <w:right w:type="dxa" w:w="100"/>
+            </w:tcMar>
+          </w:tcPr>
+          <w:p>
+            <w:pPr>
+              <w:spacing w:after="0" w:line="260"/>
+            </w:pPr>
+            <w:r>
+              <w:rPr>
+                <w:sz w:val="19"/>
+                <w:szCs w:val="19"/>
+              </w:rPr>
+              <w:t xml:space="preserve">règles métier, clauses par type de sinistre, orientation</w:t>
+            </w:r>
+          </w:p>
+        </w:tc>
+      </w:tr>
+      <w:tr>
+        <w:tc>
+          <w:tcPr>
+            <w:tcW w:type="dxa" w:w="2166"/>
+            <w:tcBorders>
+              <w:top w:val="single" w:color="BFBFBF" w:sz="4"/>
+              <w:left w:val="single" w:color="BFBFBF" w:sz="4"/>
+              <w:bottom w:val="single" w:color="BFBFBF" w:sz="4"/>
+              <w:right w:val="single" w:color="BFBFBF" w:sz="4"/>
+            </w:tcBorders>
+            <w:tcMar>
+              <w:top w:type="dxa" w:w="60"/>
+              <w:left w:type="dxa" w:w="100"/>
+              <w:bottom w:type="dxa" w:w="60"/>
+              <w:right w:type="dxa" w:w="100"/>
+            </w:tcMar>
+          </w:tcPr>
+          <w:p>
+            <w:pPr>
+              <w:spacing w:after="0" w:line="260"/>
+            </w:pPr>
+            <w:r>
+              <w:rPr>
+                <w:sz w:val="19"/>
+                <w:szCs w:val="19"/>
+              </w:rPr>
               <w:t xml:space="preserve">Qualité</w:t>
             </w:r>
           </w:p>
@@ -3133,7 +3401,7 @@
                 <w:sz w:val="19"/>
                 <w:szCs w:val="19"/>
               </w:rPr>
-              <w:t xml:space="preserve">104 tests et évaluation de la recherche</w:t>
+              <w:t xml:space="preserve">125 tests et évaluation de la recherche</w:t>
             </w:r>
           </w:p>
         </w:tc>
@@ -6349,7 +6617,7 @@
         <w:pageBreakBefore/>
       </w:pPr>
       <w:r>
-        <w:t xml:space="preserve">5. Entraînement du modèle d’analyse des sinistres</w:t>
+        <w:t xml:space="preserve">5. Modèle d’analyse des sinistres et aide à la décision</w:t>
       </w:r>
     </w:p>
     <w:p>
@@ -7888,6 +8156,648 @@
       </w:r>
       <w:r>
         <w:t xml:space="preserve">.</w:t>
+      </w:r>
+    </w:p>
+    <w:p>
+      <w:pPr>
+        <w:pStyle w:val="Heading2"/>
+      </w:pPr>
+      <w:r>
+        <w:t xml:space="preserve">5.6 Ce que le résultat permet de décider</w:t>
+      </w:r>
+    </w:p>
+    <w:p>
+      <w:pPr>
+        <w:spacing w:after="120" w:line="288"/>
+        <w:jc w:val="both"/>
+      </w:pPr>
+      <w:r>
+        <w:t xml:space="preserve">Un score seul ne sert pas au métier : un gestionnaire qui lit « 85 % » ne sait ni pourquoi, ni ce qu’il doit vérifier, ni ce que dit le contrat. La version 19 relie donc les deux briques du projet dans une seule vue, ouverte par le bouton </w:t>
+      </w:r>
+      <w:r>
+        <w:rPr>
+          <w:b/>
+          <w:bCs/>
+        </w:rPr>
+        <w:t xml:space="preserve">Analyser</w:t>
+      </w:r>
+      <w:r>
+        <w:t xml:space="preserve"> de chaque dossier (</w:t>
+      </w:r>
+      <w:r>
+        <w:rPr>
+          <w:rFonts w:ascii="Consolas" w:cs="Consolas" w:eastAsia="Consolas" w:hAnsi="Consolas"/>
+          <w:sz w:val="19"/>
+          <w:szCs w:val="19"/>
+        </w:rPr>
+        <w:t xml:space="preserve">GET /api/claims/{id}/decision-support</w:t>
+      </w:r>
+      <w:r>
+        <w:t xml:space="preserve">).</w:t>
+      </w:r>
+    </w:p>
+    <w:tbl>
+      <w:tblPr>
+        <w:tblW w:type="dxa" w:w="9026"/>
+        <w:tblBorders>
+          <w:top w:val="single" w:color="auto" w:sz="4"/>
+          <w:left w:val="single" w:color="auto" w:sz="4"/>
+          <w:bottom w:val="single" w:color="auto" w:sz="4"/>
+          <w:right w:val="single" w:color="auto" w:sz="4"/>
+          <w:insideH w:val="single" w:color="auto" w:sz="4"/>
+          <w:insideV w:val="single" w:color="auto" w:sz="4"/>
+        </w:tblBorders>
+      </w:tblPr>
+      <w:tblGrid>
+        <w:gridCol w:w="1534"/>
+        <w:gridCol w:w="3881"/>
+        <w:gridCol w:w="3611"/>
+      </w:tblGrid>
+      <w:tr>
+        <w:trPr>
+          <w:tblHeader/>
+        </w:trPr>
+        <w:tc>
+          <w:tcPr>
+            <w:tcW w:type="dxa" w:w="1534"/>
+            <w:tcBorders>
+              <w:top w:val="single" w:color="BFBFBF" w:sz="4"/>
+              <w:left w:val="single" w:color="BFBFBF" w:sz="4"/>
+              <w:bottom w:val="single" w:color="BFBFBF" w:sz="4"/>
+              <w:right w:val="single" w:color="BFBFBF" w:sz="4"/>
+            </w:tcBorders>
+            <w:shd w:fill="1F3864" w:color="auto" w:val="clear"/>
+            <w:tcMar>
+              <w:top w:type="dxa" w:w="60"/>
+              <w:left w:type="dxa" w:w="100"/>
+              <w:bottom w:type="dxa" w:w="60"/>
+              <w:right w:type="dxa" w:w="100"/>
+            </w:tcMar>
+          </w:tcPr>
+          <w:p>
+            <w:pPr>
+              <w:spacing w:after="0" w:line="260"/>
+            </w:pPr>
+            <w:r>
+              <w:rPr>
+                <w:b/>
+                <w:bCs/>
+                <w:color w:val="FFFFFF"/>
+                <w:sz w:val="19"/>
+                <w:szCs w:val="19"/>
+              </w:rPr>
+              <w:t xml:space="preserve">Bloc</w:t>
+            </w:r>
+          </w:p>
+        </w:tc>
+        <w:tc>
+          <w:tcPr>
+            <w:tcW w:type="dxa" w:w="3881"/>
+            <w:tcBorders>
+              <w:top w:val="single" w:color="BFBFBF" w:sz="4"/>
+              <w:left w:val="single" w:color="BFBFBF" w:sz="4"/>
+              <w:bottom w:val="single" w:color="BFBFBF" w:sz="4"/>
+              <w:right w:val="single" w:color="BFBFBF" w:sz="4"/>
+            </w:tcBorders>
+            <w:shd w:fill="1F3864" w:color="auto" w:val="clear"/>
+            <w:tcMar>
+              <w:top w:type="dxa" w:w="60"/>
+              <w:left w:type="dxa" w:w="100"/>
+              <w:bottom w:type="dxa" w:w="60"/>
+              <w:right w:type="dxa" w:w="100"/>
+            </w:tcMar>
+          </w:tcPr>
+          <w:p>
+            <w:pPr>
+              <w:spacing w:after="0" w:line="260"/>
+            </w:pPr>
+            <w:r>
+              <w:rPr>
+                <w:b/>
+                <w:bCs/>
+                <w:color w:val="FFFFFF"/>
+                <w:sz w:val="19"/>
+                <w:szCs w:val="19"/>
+              </w:rPr>
+              <w:t xml:space="preserve">Contenu</w:t>
+            </w:r>
+          </w:p>
+        </w:tc>
+        <w:tc>
+          <w:tcPr>
+            <w:tcW w:type="dxa" w:w="3611"/>
+            <w:tcBorders>
+              <w:top w:val="single" w:color="BFBFBF" w:sz="4"/>
+              <w:left w:val="single" w:color="BFBFBF" w:sz="4"/>
+              <w:bottom w:val="single" w:color="BFBFBF" w:sz="4"/>
+              <w:right w:val="single" w:color="BFBFBF" w:sz="4"/>
+            </w:tcBorders>
+            <w:shd w:fill="1F3864" w:color="auto" w:val="clear"/>
+            <w:tcMar>
+              <w:top w:type="dxa" w:w="60"/>
+              <w:left w:type="dxa" w:w="100"/>
+              <w:bottom w:type="dxa" w:w="60"/>
+              <w:right w:type="dxa" w:w="100"/>
+            </w:tcMar>
+          </w:tcPr>
+          <w:p>
+            <w:pPr>
+              <w:spacing w:after="0" w:line="260"/>
+            </w:pPr>
+            <w:r>
+              <w:rPr>
+                <w:b/>
+                <w:bCs/>
+                <w:color w:val="FFFFFF"/>
+                <w:sz w:val="19"/>
+                <w:szCs w:val="19"/>
+              </w:rPr>
+              <w:t xml:space="preserve">Comment il est produit</w:t>
+            </w:r>
+          </w:p>
+        </w:tc>
+      </w:tr>
+      <w:tr>
+        <w:tc>
+          <w:tcPr>
+            <w:tcW w:type="dxa" w:w="1534"/>
+            <w:tcBorders>
+              <w:top w:val="single" w:color="BFBFBF" w:sz="4"/>
+              <w:left w:val="single" w:color="BFBFBF" w:sz="4"/>
+              <w:bottom w:val="single" w:color="BFBFBF" w:sz="4"/>
+              <w:right w:val="single" w:color="BFBFBF" w:sz="4"/>
+            </w:tcBorders>
+            <w:tcMar>
+              <w:top w:type="dxa" w:w="60"/>
+              <w:left w:type="dxa" w:w="100"/>
+              <w:bottom w:type="dxa" w:w="60"/>
+              <w:right w:type="dxa" w:w="100"/>
+            </w:tcMar>
+          </w:tcPr>
+          <w:p>
+            <w:pPr>
+              <w:spacing w:after="0" w:line="260"/>
+            </w:pPr>
+            <w:r>
+              <w:rPr>
+                <w:sz w:val="19"/>
+                <w:szCs w:val="19"/>
+              </w:rPr>
+              <w:t xml:space="preserve">Score expliqué</w:t>
+            </w:r>
+          </w:p>
+        </w:tc>
+        <w:tc>
+          <w:tcPr>
+            <w:tcW w:type="dxa" w:w="3881"/>
+            <w:tcBorders>
+              <w:top w:val="single" w:color="BFBFBF" w:sz="4"/>
+              <w:left w:val="single" w:color="BFBFBF" w:sz="4"/>
+              <w:bottom w:val="single" w:color="BFBFBF" w:sz="4"/>
+              <w:right w:val="single" w:color="BFBFBF" w:sz="4"/>
+            </w:tcBorders>
+            <w:tcMar>
+              <w:top w:type="dxa" w:w="60"/>
+              <w:left w:type="dxa" w:w="100"/>
+              <w:bottom w:type="dxa" w:w="60"/>
+              <w:right w:type="dxa" w:w="100"/>
+            </w:tcMar>
+          </w:tcPr>
+          <w:p>
+            <w:pPr>
+              <w:spacing w:after="0" w:line="260"/>
+            </w:pPr>
+            <w:r>
+              <w:rPr>
+                <w:sz w:val="19"/>
+                <w:szCs w:val="19"/>
+              </w:rPr>
+              <w:t xml:space="preserve">probabilité indicative et facteurs qui la font monter ou baisser</w:t>
+            </w:r>
+          </w:p>
+        </w:tc>
+        <w:tc>
+          <w:tcPr>
+            <w:tcW w:type="dxa" w:w="3611"/>
+            <w:tcBorders>
+              <w:top w:val="single" w:color="BFBFBF" w:sz="4"/>
+              <w:left w:val="single" w:color="BFBFBF" w:sz="4"/>
+              <w:bottom w:val="single" w:color="BFBFBF" w:sz="4"/>
+              <w:right w:val="single" w:color="BFBFBF" w:sz="4"/>
+            </w:tcBorders>
+            <w:tcMar>
+              <w:top w:type="dxa" w:w="60"/>
+              <w:left w:type="dxa" w:w="100"/>
+              <w:bottom w:type="dxa" w:w="60"/>
+              <w:right w:type="dxa" w:w="100"/>
+            </w:tcMar>
+          </w:tcPr>
+          <w:p>
+            <w:pPr>
+              <w:spacing w:after="0" w:line="260"/>
+            </w:pPr>
+            <w:r>
+              <w:rPr>
+                <w:sz w:val="19"/>
+                <w:szCs w:val="19"/>
+              </w:rPr>
+              <w:t xml:space="preserve">contributions coefficient × valeur de la régression logistique, sur l’échelle du logit</w:t>
+            </w:r>
+          </w:p>
+        </w:tc>
+      </w:tr>
+      <w:tr>
+        <w:tc>
+          <w:tcPr>
+            <w:tcW w:type="dxa" w:w="1534"/>
+            <w:tcBorders>
+              <w:top w:val="single" w:color="BFBFBF" w:sz="4"/>
+              <w:left w:val="single" w:color="BFBFBF" w:sz="4"/>
+              <w:bottom w:val="single" w:color="BFBFBF" w:sz="4"/>
+              <w:right w:val="single" w:color="BFBFBF" w:sz="4"/>
+            </w:tcBorders>
+            <w:tcMar>
+              <w:top w:type="dxa" w:w="60"/>
+              <w:left w:type="dxa" w:w="100"/>
+              <w:bottom w:type="dxa" w:w="60"/>
+              <w:right w:type="dxa" w:w="100"/>
+            </w:tcMar>
+          </w:tcPr>
+          <w:p>
+            <w:pPr>
+              <w:spacing w:after="0" w:line="260"/>
+            </w:pPr>
+            <w:r>
+              <w:rPr>
+                <w:sz w:val="19"/>
+                <w:szCs w:val="19"/>
+              </w:rPr>
+              <w:t xml:space="preserve">Points à vérifier</w:t>
+            </w:r>
+          </w:p>
+        </w:tc>
+        <w:tc>
+          <w:tcPr>
+            <w:tcW w:type="dxa" w:w="3881"/>
+            <w:tcBorders>
+              <w:top w:val="single" w:color="BFBFBF" w:sz="4"/>
+              <w:left w:val="single" w:color="BFBFBF" w:sz="4"/>
+              <w:bottom w:val="single" w:color="BFBFBF" w:sz="4"/>
+              <w:right w:val="single" w:color="BFBFBF" w:sz="4"/>
+            </w:tcBorders>
+            <w:tcMar>
+              <w:top w:type="dxa" w:w="60"/>
+              <w:left w:type="dxa" w:w="100"/>
+              <w:bottom w:type="dxa" w:w="60"/>
+              <w:right w:type="dxa" w:w="100"/>
+            </w:tcMar>
+          </w:tcPr>
+          <w:p>
+            <w:pPr>
+              <w:spacing w:after="0" w:line="260"/>
+            </w:pPr>
+            <w:r>
+              <w:rPr>
+                <w:sz w:val="19"/>
+                <w:szCs w:val="19"/>
+              </w:rPr>
+              <w:t xml:space="preserve">bloquants (dossier incomplet, garantie à vérifier) et signaux d’attention (montant au-delà du 90e centile, 3 sinistres antérieurs ou plus, Pending de plus de 30 ou 90 jours)</w:t>
+            </w:r>
+          </w:p>
+        </w:tc>
+        <w:tc>
+          <w:tcPr>
+            <w:tcW w:type="dxa" w:w="3611"/>
+            <w:tcBorders>
+              <w:top w:val="single" w:color="BFBFBF" w:sz="4"/>
+              <w:left w:val="single" w:color="BFBFBF" w:sz="4"/>
+              <w:bottom w:val="single" w:color="BFBFBF" w:sz="4"/>
+              <w:right w:val="single" w:color="BFBFBF" w:sz="4"/>
+            </w:tcBorders>
+            <w:tcMar>
+              <w:top w:type="dxa" w:w="60"/>
+              <w:left w:type="dxa" w:w="100"/>
+              <w:bottom w:type="dxa" w:w="60"/>
+              <w:right w:type="dxa" w:w="100"/>
+            </w:tcMar>
+          </w:tcPr>
+          <w:p>
+            <w:pPr>
+              <w:spacing w:after="0" w:line="260"/>
+            </w:pPr>
+            <w:r>
+              <w:rPr>
+                <w:sz w:val="19"/>
+                <w:szCs w:val="19"/>
+              </w:rPr>
+              <w:t xml:space="preserve">règles métier explicites, aux seuils lisibles et discutables</w:t>
+            </w:r>
+          </w:p>
+        </w:tc>
+      </w:tr>
+      <w:tr>
+        <w:tc>
+          <w:tcPr>
+            <w:tcW w:type="dxa" w:w="1534"/>
+            <w:tcBorders>
+              <w:top w:val="single" w:color="BFBFBF" w:sz="4"/>
+              <w:left w:val="single" w:color="BFBFBF" w:sz="4"/>
+              <w:bottom w:val="single" w:color="BFBFBF" w:sz="4"/>
+              <w:right w:val="single" w:color="BFBFBF" w:sz="4"/>
+            </w:tcBorders>
+            <w:tcMar>
+              <w:top w:type="dxa" w:w="60"/>
+              <w:left w:type="dxa" w:w="100"/>
+              <w:bottom w:type="dxa" w:w="60"/>
+              <w:right w:type="dxa" w:w="100"/>
+            </w:tcMar>
+          </w:tcPr>
+          <w:p>
+            <w:pPr>
+              <w:spacing w:after="0" w:line="260"/>
+            </w:pPr>
+            <w:r>
+              <w:rPr>
+                <w:sz w:val="19"/>
+                <w:szCs w:val="19"/>
+              </w:rPr>
+              <w:t xml:space="preserve">Ce que dit le contrat</w:t>
+            </w:r>
+          </w:p>
+        </w:tc>
+        <w:tc>
+          <w:tcPr>
+            <w:tcW w:type="dxa" w:w="3881"/>
+            <w:tcBorders>
+              <w:top w:val="single" w:color="BFBFBF" w:sz="4"/>
+              <w:left w:val="single" w:color="BFBFBF" w:sz="4"/>
+              <w:bottom w:val="single" w:color="BFBFBF" w:sz="4"/>
+              <w:right w:val="single" w:color="BFBFBF" w:sz="4"/>
+            </w:tcBorders>
+            <w:tcMar>
+              <w:top w:type="dxa" w:w="60"/>
+              <w:left w:type="dxa" w:w="100"/>
+              <w:bottom w:type="dxa" w:w="60"/>
+              <w:right w:type="dxa" w:w="100"/>
+            </w:tcMar>
+          </w:tcPr>
+          <w:p>
+            <w:pPr>
+              <w:spacing w:after="0" w:line="260"/>
+            </w:pPr>
+            <w:r>
+              <w:rPr>
+                <w:sz w:val="19"/>
+                <w:szCs w:val="19"/>
+              </w:rPr>
+              <w:t xml:space="preserve">fiches de couverture, d’exclusions, d’indemnisation et de franchise du type de sinistre</w:t>
+            </w:r>
+          </w:p>
+        </w:tc>
+        <w:tc>
+          <w:tcPr>
+            <w:tcW w:type="dxa" w:w="3611"/>
+            <w:tcBorders>
+              <w:top w:val="single" w:color="BFBFBF" w:sz="4"/>
+              <w:left w:val="single" w:color="BFBFBF" w:sz="4"/>
+              <w:bottom w:val="single" w:color="BFBFBF" w:sz="4"/>
+              <w:right w:val="single" w:color="BFBFBF" w:sz="4"/>
+            </w:tcBorders>
+            <w:tcMar>
+              <w:top w:type="dxa" w:w="60"/>
+              <w:left w:type="dxa" w:w="100"/>
+              <w:bottom w:type="dxa" w:w="60"/>
+              <w:right w:type="dxa" w:w="100"/>
+            </w:tcMar>
+          </w:tcPr>
+          <w:p>
+            <w:pPr>
+              <w:spacing w:after="0" w:line="260"/>
+            </w:pPr>
+            <w:r>
+              <w:rPr>
+                <w:sz w:val="19"/>
+                <w:szCs w:val="19"/>
+              </w:rPr>
+              <w:t xml:space="preserve">table de correspondance type de sinistre → fiches, validable par un expert ; chaque fiche ouvre l’assistant RAG</w:t>
+            </w:r>
+          </w:p>
+        </w:tc>
+      </w:tr>
+      <w:tr>
+        <w:tc>
+          <w:tcPr>
+            <w:tcW w:type="dxa" w:w="1534"/>
+            <w:tcBorders>
+              <w:top w:val="single" w:color="BFBFBF" w:sz="4"/>
+              <w:left w:val="single" w:color="BFBFBF" w:sz="4"/>
+              <w:bottom w:val="single" w:color="BFBFBF" w:sz="4"/>
+              <w:right w:val="single" w:color="BFBFBF" w:sz="4"/>
+            </w:tcBorders>
+            <w:tcMar>
+              <w:top w:type="dxa" w:w="60"/>
+              <w:left w:type="dxa" w:w="100"/>
+              <w:bottom w:type="dxa" w:w="60"/>
+              <w:right w:type="dxa" w:w="100"/>
+            </w:tcMar>
+          </w:tcPr>
+          <w:p>
+            <w:pPr>
+              <w:spacing w:after="0" w:line="260"/>
+            </w:pPr>
+            <w:r>
+              <w:rPr>
+                <w:sz w:val="19"/>
+                <w:szCs w:val="19"/>
+              </w:rPr>
+              <w:t xml:space="preserve">Orientation</w:t>
+            </w:r>
+          </w:p>
+        </w:tc>
+        <w:tc>
+          <w:tcPr>
+            <w:tcW w:type="dxa" w:w="3881"/>
+            <w:tcBorders>
+              <w:top w:val="single" w:color="BFBFBF" w:sz="4"/>
+              <w:left w:val="single" w:color="BFBFBF" w:sz="4"/>
+              <w:bottom w:val="single" w:color="BFBFBF" w:sz="4"/>
+              <w:right w:val="single" w:color="BFBFBF" w:sz="4"/>
+            </w:tcBorders>
+            <w:tcMar>
+              <w:top w:type="dxa" w:w="60"/>
+              <w:left w:type="dxa" w:w="100"/>
+              <w:bottom w:type="dxa" w:w="60"/>
+              <w:right w:type="dxa" w:w="100"/>
+            </w:tcMar>
+          </w:tcPr>
+          <w:p>
+            <w:pPr>
+              <w:spacing w:after="0" w:line="260"/>
+            </w:pPr>
+            <w:r>
+              <w:rPr>
+                <w:sz w:val="19"/>
+                <w:szCs w:val="19"/>
+              </w:rPr>
+              <w:t xml:space="preserve">« compléter le dossier », « vérifier le contrat », « examiner les exclusions », « éléments favorables », « analyse approfondie »</w:t>
+            </w:r>
+          </w:p>
+        </w:tc>
+        <w:tc>
+          <w:tcPr>
+            <w:tcW w:type="dxa" w:w="3611"/>
+            <w:tcBorders>
+              <w:top w:val="single" w:color="BFBFBF" w:sz="4"/>
+              <w:left w:val="single" w:color="BFBFBF" w:sz="4"/>
+              <w:bottom w:val="single" w:color="BFBFBF" w:sz="4"/>
+              <w:right w:val="single" w:color="BFBFBF" w:sz="4"/>
+            </w:tcBorders>
+            <w:tcMar>
+              <w:top w:type="dxa" w:w="60"/>
+              <w:left w:type="dxa" w:w="100"/>
+              <w:bottom w:type="dxa" w:w="60"/>
+              <w:right w:type="dxa" w:w="100"/>
+            </w:tcMar>
+          </w:tcPr>
+          <w:p>
+            <w:pPr>
+              <w:spacing w:after="0" w:line="260"/>
+            </w:pPr>
+            <w:r>
+              <w:rPr>
+                <w:sz w:val="19"/>
+                <w:szCs w:val="19"/>
+              </w:rPr>
+              <w:t xml:space="preserve">combinaison des points bloquants, des trous du corpus et du score</w:t>
+            </w:r>
+          </w:p>
+        </w:tc>
+      </w:tr>
+    </w:tbl>
+    <w:p>
+      <w:pPr>
+        <w:spacing w:after="200" w:before="60"/>
+        <w:jc w:val="center"/>
+      </w:pPr>
+      <w:r>
+        <w:rPr>
+          <w:i/>
+          <w:iCs/>
+          <w:color w:val="595959"/>
+          <w:sz w:val="19"/>
+          <w:szCs w:val="19"/>
+        </w:rPr>
+        <w:t xml:space="preserve">Tableau 5a — Contenu de la vue d’aide à la décision</w:t>
+      </w:r>
+    </w:p>
+    <w:p>
+      <w:pPr>
+        <w:spacing w:after="60" w:before="120"/>
+        <w:jc w:val="center"/>
+      </w:pPr>
+      <w:r>
+        <w:drawing>
+          <wp:inline distT="0" distB="0" distL="0" distR="0">
+            <wp:extent cx="4953000" cy="5876925"/>
+            <wp:effectExtent t="0" r="0" b="0" l="0"/>
+            <wp:docPr id="1" name="" descr="" title=""/>
+            <wp:cNvGraphicFramePr>
+              <a:graphicFrameLocks xmlns:a="http://schemas.openxmlformats.org/drawingml/2006/main" noChangeAspect="1"/>
+            </wp:cNvGraphicFramePr>
+            <a:graphic xmlns:a="http://schemas.openxmlformats.org/drawingml/2006/main">
+              <a:graphicData uri="http://schemas.openxmlformats.org/drawingml/2006/picture">
+                <pic:pic xmlns:pic="http://schemas.openxmlformats.org/drawingml/2006/picture">
+                  <pic:nvPicPr>
+                    <pic:cNvPr id="0" name="" descr=""/>
+                    <pic:cNvPicPr>
+                      <a:picLocks noChangeAspect="1" noChangeArrowheads="1"/>
+                    </pic:cNvPicPr>
+                  </pic:nvPicPr>
+                  <pic:blipFill>
+                    <a:blip r:embed="rId11" cstate="none"/>
+                    <a:srcRect/>
+                    <a:stretch>
+                      <a:fillRect/>
+                    </a:stretch>
+                  </pic:blipFill>
+                  <pic:spPr bwMode="auto">
+                    <a:xfrm>
+                      <a:off x="0" y="0"/>
+                      <a:ext cx="4953000" cy="5876925"/>
+                    </a:xfrm>
+                    <a:prstGeom prst="rect">
+                      <a:avLst/>
+                    </a:prstGeom>
+                  </pic:spPr>
+                </pic:pic>
+              </a:graphicData>
+            </a:graphic>
+          </wp:inline>
+        </w:drawing>
+      </w:r>
+    </w:p>
+    <w:p>
+      <w:pPr>
+        <w:spacing w:after="200" w:before="60"/>
+        <w:jc w:val="center"/>
+      </w:pPr>
+      <w:r>
+        <w:rPr>
+          <w:i/>
+          <w:iCs/>
+          <w:color w:val="595959"/>
+          <w:sz w:val="19"/>
+          <w:szCs w:val="19"/>
+        </w:rPr>
+        <w:t xml:space="preserve">Figure 2 — Aide à la décision pour le dossier fictif C00020 (catastrophe naturelle, en attente)</w:t>
+      </w:r>
+    </w:p>
+    <w:p>
+      <w:pPr>
+        <w:spacing w:after="120" w:line="288"/>
+        <w:jc w:val="both"/>
+      </w:pPr>
+      <w:r>
+        <w:rPr>
+          <w:b/>
+          <w:bCs/>
+        </w:rPr>
+        <w:t xml:space="preserve">Choix de conception : une table de correspondance plutôt qu’une recherche libre.</w:t>
+      </w:r>
+      <w:r>
+        <w:t xml:space="preserve"> Les premiers essais de recherche libre (« bris de glace exclusions ») ramenaient des fiches voisines mais fausses, comme celle de l’assurance de garage. Pour une vue destinée à décider, une table explicite « type de sinistre → fiches » est préférable : elle est déterministe, vérifiable par un expert, et elle révèle les </w:t>
+      </w:r>
+      <w:r>
+        <w:rPr>
+          <w:b/>
+          <w:bCs/>
+        </w:rPr>
+        <w:t xml:space="preserve">trous du corpus</w:t>
+      </w:r>
+      <w:r>
+        <w:t xml:space="preserve">. Aucune fiche ne traite de l’incendie, et le bris de glace n’est couvert que par des cas particuliers : l’application le signale et oriente vers les conditions générales au lieu de présenter des fiches sans rapport.</w:t>
+      </w:r>
+    </w:p>
+    <w:p>
+      <w:pPr>
+        <w:spacing w:after="120" w:line="288"/>
+        <w:jc w:val="both"/>
+      </w:pPr>
+      <w:r>
+        <w:t xml:space="preserve">Sur les 120 dossiers, l’orientation se répartit ainsi : 36 « compléter le dossier », 32 « vérifier le contrat » (incendie et bris de glace), 26 « analyse approfondie », 17 « éléments favorables » et 9 « éléments défavorables ». Cette répartition est elle-même une information de pilotage : près d’un dossier sur trois est bloqué par une pièce ou une garantie à confirmer, et non par une question de fond.</w:t>
+      </w:r>
+    </w:p>
+    <w:p>
+      <w:pPr>
+        <w:pBdr>
+          <w:left w:val="single" w:color="2E75B6" w:sz="18" w:space="8"/>
+        </w:pBdr>
+        <w:shd w:fill="DEEAF6" w:color="auto" w:val="clear"/>
+        <w:spacing w:after="160" w:before="80" w:line="276"/>
+        <w:ind w:left="200" w:right="200"/>
+      </w:pPr>
+      <w:r>
+        <w:t xml:space="preserve">L’orientation résume les éléments disponibles ; elle ne décide pas. Les seuils (90e centile, 30 et 90 jours, 3 sinistres) sont des choix de démonstration à valider avec le métier.</w:t>
       </w:r>
     </w:p>
     <w:p>
@@ -9645,7 +10555,127 @@
                 <w:sz w:val="19"/>
                 <w:szCs w:val="19"/>
               </w:rPr>
-              <w:t xml:space="preserve">104 tests ; jeu tenu à part : 36,7 % → 46,7 % ; texte lu − 50 à − 64 %</w:t>
+              <w:t xml:space="preserve">125 tests ; jeu tenu à part : 36,7 % → 46,7 % ; texte lu − 50 à − 64 %</w:t>
+            </w:r>
+          </w:p>
+        </w:tc>
+      </w:tr>
+      <w:tr>
+        <w:tc>
+          <w:tcPr>
+            <w:tcW w:type="dxa" w:w="992"/>
+            <w:tcBorders>
+              <w:top w:val="single" w:color="BFBFBF" w:sz="4"/>
+              <w:left w:val="single" w:color="BFBFBF" w:sz="4"/>
+              <w:bottom w:val="single" w:color="BFBFBF" w:sz="4"/>
+              <w:right w:val="single" w:color="BFBFBF" w:sz="4"/>
+            </w:tcBorders>
+            <w:tcMar>
+              <w:top w:type="dxa" w:w="60"/>
+              <w:left w:type="dxa" w:w="100"/>
+              <w:bottom w:type="dxa" w:w="60"/>
+              <w:right w:type="dxa" w:w="100"/>
+            </w:tcMar>
+          </w:tcPr>
+          <w:p>
+            <w:pPr>
+              <w:spacing w:after="0" w:line="260"/>
+            </w:pPr>
+            <w:r>
+              <w:rPr>
+                <w:b/>
+                <w:bCs/>
+                <w:sz w:val="19"/>
+                <w:szCs w:val="19"/>
+              </w:rPr>
+              <w:t xml:space="preserve">19.0.0 (fin)</w:t>
+            </w:r>
+          </w:p>
+        </w:tc>
+        <w:tc>
+          <w:tcPr>
+            <w:tcW w:type="dxa" w:w="2707"/>
+            <w:tcBorders>
+              <w:top w:val="single" w:color="BFBFBF" w:sz="4"/>
+              <w:left w:val="single" w:color="BFBFBF" w:sz="4"/>
+              <w:bottom w:val="single" w:color="BFBFBF" w:sz="4"/>
+              <w:right w:val="single" w:color="BFBFBF" w:sz="4"/>
+            </w:tcBorders>
+            <w:tcMar>
+              <w:top w:type="dxa" w:w="60"/>
+              <w:left w:type="dxa" w:w="100"/>
+              <w:bottom w:type="dxa" w:w="60"/>
+              <w:right w:type="dxa" w:w="100"/>
+            </w:tcMar>
+          </w:tcPr>
+          <w:p>
+            <w:pPr>
+              <w:spacing w:after="0" w:line="260"/>
+            </w:pPr>
+            <w:r>
+              <w:rPr>
+                <w:sz w:val="19"/>
+                <w:szCs w:val="19"/>
+              </w:rPr>
+              <w:t xml:space="preserve">score et contrat présentés séparément : le métier ne sait pas quoi décider</w:t>
+            </w:r>
+          </w:p>
+        </w:tc>
+        <w:tc>
+          <w:tcPr>
+            <w:tcW w:type="dxa" w:w="2978"/>
+            <w:tcBorders>
+              <w:top w:val="single" w:color="BFBFBF" w:sz="4"/>
+              <w:left w:val="single" w:color="BFBFBF" w:sz="4"/>
+              <w:bottom w:val="single" w:color="BFBFBF" w:sz="4"/>
+              <w:right w:val="single" w:color="BFBFBF" w:sz="4"/>
+            </w:tcBorders>
+            <w:tcMar>
+              <w:top w:type="dxa" w:w="60"/>
+              <w:left w:type="dxa" w:w="100"/>
+              <w:bottom w:type="dxa" w:w="60"/>
+              <w:right w:type="dxa" w:w="100"/>
+            </w:tcMar>
+          </w:tcPr>
+          <w:p>
+            <w:pPr>
+              <w:spacing w:after="0" w:line="260"/>
+            </w:pPr>
+            <w:r>
+              <w:rPr>
+                <w:sz w:val="19"/>
+                <w:szCs w:val="19"/>
+              </w:rPr>
+              <w:t xml:space="preserve">aide à la décision par dossier</w:t>
+            </w:r>
+          </w:p>
+        </w:tc>
+        <w:tc>
+          <w:tcPr>
+            <w:tcW w:type="dxa" w:w="2349"/>
+            <w:tcBorders>
+              <w:top w:val="single" w:color="BFBFBF" w:sz="4"/>
+              <w:left w:val="single" w:color="BFBFBF" w:sz="4"/>
+              <w:bottom w:val="single" w:color="BFBFBF" w:sz="4"/>
+              <w:right w:val="single" w:color="BFBFBF" w:sz="4"/>
+            </w:tcBorders>
+            <w:tcMar>
+              <w:top w:type="dxa" w:w="60"/>
+              <w:left w:type="dxa" w:w="100"/>
+              <w:bottom w:type="dxa" w:w="60"/>
+              <w:right w:type="dxa" w:w="100"/>
+            </w:tcMar>
+          </w:tcPr>
+          <w:p>
+            <w:pPr>
+              <w:spacing w:after="0" w:line="260"/>
+            </w:pPr>
+            <w:r>
+              <w:rPr>
+                <w:sz w:val="19"/>
+                <w:szCs w:val="19"/>
+              </w:rPr>
+              <w:t xml:space="preserve">orientation pour les 120 dossiers</w:t>
             </w:r>
           </w:p>
         </w:tc>
@@ -13679,7 +14709,7 @@
                 <w:sz w:val="19"/>
                 <w:szCs w:val="19"/>
               </w:rPr>
-              <w:t xml:space="preserve">test_claims.py</w:t>
+              <w:t xml:space="preserve">test_decision.py</w:t>
             </w:r>
           </w:p>
         </w:tc>
@@ -13708,7 +14738,7 @@
                 <w:sz w:val="19"/>
                 <w:szCs w:val="19"/>
               </w:rPr>
-              <w:t xml:space="preserve">6</w:t>
+              <w:t xml:space="preserve">21</w:t>
             </w:r>
           </w:p>
         </w:tc>
@@ -13737,7 +14767,7 @@
                 <w:sz w:val="19"/>
                 <w:szCs w:val="19"/>
               </w:rPr>
-              <w:t xml:space="preserve">jeu fictif bien formé, Pending exclus, entraînement sur dossiers clos, métriques dans [0, 1], reproductibilité</w:t>
+              <w:t xml:space="preserve">correspondance clauses / corpus, trous du corpus signalés, chaque règle métier, chaque orientation, explication du score, route d’aide à la décision</w:t>
             </w:r>
           </w:p>
         </w:tc>
@@ -13769,7 +14799,7 @@
                 <w:sz w:val="19"/>
                 <w:szCs w:val="19"/>
               </w:rPr>
-              <w:t xml:space="preserve">test_project.py</w:t>
+              <w:t xml:space="preserve">test_claims.py</w:t>
             </w:r>
           </w:p>
         </w:tc>
@@ -13798,7 +14828,7 @@
                 <w:sz w:val="19"/>
                 <w:szCs w:val="19"/>
               </w:rPr>
-              <w:t xml:space="preserve">10</w:t>
+              <w:t xml:space="preserve">6</w:t>
             </w:r>
           </w:p>
         </w:tc>
@@ -13827,7 +14857,7 @@
                 <w:sz w:val="19"/>
                 <w:szCs w:val="19"/>
               </w:rPr>
-              <w:t xml:space="preserve">dépendances, contenu de l’image Docker, port du Space, déploiement conditionné, interface, documentation d’examen</w:t>
+              <w:t xml:space="preserve">jeu fictif bien formé, Pending exclus, entraînement sur dossiers clos, métriques dans [0, 1], reproductibilité</w:t>
             </w:r>
           </w:p>
         </w:tc>
@@ -13855,6 +14885,96 @@
             </w:pPr>
             <w:r>
               <w:rPr>
+                <w:rFonts w:ascii="Consolas" w:cs="Consolas" w:eastAsia="Consolas" w:hAnsi="Consolas"/>
+                <w:sz w:val="19"/>
+                <w:szCs w:val="19"/>
+              </w:rPr>
+              <w:t xml:space="preserve">test_project.py</w:t>
+            </w:r>
+          </w:p>
+        </w:tc>
+        <w:tc>
+          <w:tcPr>
+            <w:tcW w:type="dxa" w:w="812"/>
+            <w:tcBorders>
+              <w:top w:val="single" w:color="BFBFBF" w:sz="4"/>
+              <w:left w:val="single" w:color="BFBFBF" w:sz="4"/>
+              <w:bottom w:val="single" w:color="BFBFBF" w:sz="4"/>
+              <w:right w:val="single" w:color="BFBFBF" w:sz="4"/>
+            </w:tcBorders>
+            <w:tcMar>
+              <w:top w:type="dxa" w:w="60"/>
+              <w:left w:type="dxa" w:w="100"/>
+              <w:bottom w:type="dxa" w:w="60"/>
+              <w:right w:type="dxa" w:w="100"/>
+            </w:tcMar>
+          </w:tcPr>
+          <w:p>
+            <w:pPr>
+              <w:spacing w:after="0" w:line="260"/>
+            </w:pPr>
+            <w:r>
+              <w:rPr>
+                <w:sz w:val="19"/>
+                <w:szCs w:val="19"/>
+              </w:rPr>
+              <w:t xml:space="preserve">10</w:t>
+            </w:r>
+          </w:p>
+        </w:tc>
+        <w:tc>
+          <w:tcPr>
+            <w:tcW w:type="dxa" w:w="6229"/>
+            <w:tcBorders>
+              <w:top w:val="single" w:color="BFBFBF" w:sz="4"/>
+              <w:left w:val="single" w:color="BFBFBF" w:sz="4"/>
+              <w:bottom w:val="single" w:color="BFBFBF" w:sz="4"/>
+              <w:right w:val="single" w:color="BFBFBF" w:sz="4"/>
+            </w:tcBorders>
+            <w:tcMar>
+              <w:top w:type="dxa" w:w="60"/>
+              <w:left w:type="dxa" w:w="100"/>
+              <w:bottom w:type="dxa" w:w="60"/>
+              <w:right w:type="dxa" w:w="100"/>
+            </w:tcMar>
+          </w:tcPr>
+          <w:p>
+            <w:pPr>
+              <w:spacing w:after="0" w:line="260"/>
+            </w:pPr>
+            <w:r>
+              <w:rPr>
+                <w:sz w:val="19"/>
+                <w:szCs w:val="19"/>
+              </w:rPr>
+              <w:t xml:space="preserve">dépendances, contenu de l’image Docker, port du Space, déploiement conditionné, interface, documentation d’examen</w:t>
+            </w:r>
+          </w:p>
+        </w:tc>
+      </w:tr>
+      <w:tr>
+        <w:tc>
+          <w:tcPr>
+            <w:tcW w:type="dxa" w:w="1985"/>
+            <w:tcBorders>
+              <w:top w:val="single" w:color="BFBFBF" w:sz="4"/>
+              <w:left w:val="single" w:color="BFBFBF" w:sz="4"/>
+              <w:bottom w:val="single" w:color="BFBFBF" w:sz="4"/>
+              <w:right w:val="single" w:color="BFBFBF" w:sz="4"/>
+            </w:tcBorders>
+            <w:tcMar>
+              <w:top w:type="dxa" w:w="60"/>
+              <w:left w:type="dxa" w:w="100"/>
+              <w:bottom w:type="dxa" w:w="60"/>
+              <w:right w:type="dxa" w:w="100"/>
+            </w:tcMar>
+          </w:tcPr>
+          <w:p>
+            <w:pPr>
+              <w:spacing w:after="0" w:line="260"/>
+            </w:pPr>
+            <w:r>
+              <w:rPr>
                 <w:b/>
                 <w:bCs/>
                 <w:sz w:val="19"/>
@@ -13891,7 +15011,7 @@
                 <w:sz w:val="19"/>
                 <w:szCs w:val="19"/>
               </w:rPr>
-              <w:t xml:space="preserve">104</w:t>
+              <w:t xml:space="preserve">125</w:t>
             </w:r>
           </w:p>
         </w:tc>
@@ -13973,7 +15093,7 @@
           <w:b/>
           <w:bCs/>
         </w:rPr>
-        <w:t xml:space="preserve">98 tests ont réussi et 6 ont été ignorés</w:t>
+        <w:t xml:space="preserve">119 tests ont réussi et 6 ont été ignorés</w:t>
       </w:r>
       <w:r>
         <w:t xml:space="preserve">. Les 6 tests ignorés sont les tests HTTP de bout en bout, qui nécessitent la bibliothèque </w:t>
@@ -15898,7 +17018,7 @@
                 <w:sz w:val="19"/>
                 <w:szCs w:val="19"/>
               </w:rPr>
-              <w:t xml:space="preserve">analyser le dossier C00001</w:t>
+              <w:t xml:space="preserve">analyser le dossier C00020</w:t>
             </w:r>
           </w:p>
         </w:tc>
@@ -15927,7 +17047,7 @@
                 <w:sz w:val="19"/>
                 <w:szCs w:val="19"/>
               </w:rPr>
-              <w:t xml:space="preserve">probabilité ≈ 85 %, facteurs, mention de validation humaine</w:t>
+              <w:t xml:space="preserve">orientation « compléter le dossier », garantie à vérifier, facteurs du score, clauses du contrat</w:t>
             </w:r>
           </w:p>
         </w:tc>
@@ -16386,10 +17506,10 @@
           <w:b/>
           <w:bCs/>
         </w:rPr>
-        <w:t xml:space="preserve">Relier les deux briques</w:t>
-      </w:r>
-      <w:r>
-        <w:t xml:space="preserve"> : interroger automatiquement le RAG avec le type de sinistre d’un dossier pour afficher les clauses applicables à côté du score.</w:t>
+        <w:t xml:space="preserve">Faire valider par le métier</w:t>
+      </w:r>
+      <w:r>
+        <w:t xml:space="preserve"> la table de correspondance des clauses, les seuils des règles et le libellé des orientations.</w:t>
       </w:r>
     </w:p>
     <w:p>
@@ -16407,7 +17527,7 @@
         <w:jc w:val="both"/>
       </w:pPr>
       <w:r>
-        <w:t xml:space="preserve">Insurance Claims Assistance réunit trois compétences complémentaires : la recherche d’information, l’usage contrôlé d’un modèle de langage et l’apprentissage supervisé. L’application est en ligne, vérifiable en une dizaine de minutes, et protégée par 104 tests qui conditionnent son déploiement. Ses réponses sont typées, et chaque extrait affiché a été retrouvé par l’application dans la source citée.</w:t>
+        <w:t xml:space="preserve">Insurance Claims Assistance réunit trois compétences complémentaires : la recherche d’information, l’usage contrôlé d’un modèle de langage et l’apprentissage supervisé. L’application est en ligne, vérifiable en une dizaine de minutes, et protégée par 125 tests qui conditionnent son déploiement. Ses réponses sont typées, chaque extrait affiché a été retrouvé par l’application dans la source citée, et chaque dossier dispose d’une vue qui relie le score, les points à vérifier et les clauses du contrat.</w:t>
       </w:r>
     </w:p>
     <w:p>
@@ -16538,7 +17658,7 @@
           <w:sz w:val="18"/>
           <w:szCs w:val="18"/>
         </w:rPr>
-        <w:t xml:space="preserve">│   └── claims_analytics.py   modèle des sinistres</w:t>
+        <w:t xml:space="preserve">│   ├── claim_decision.py aide à la décision</w:t>
       </w:r>
     </w:p>
     <w:p>
@@ -16553,7 +17673,7 @@
           <w:sz w:val="18"/>
           <w:szCs w:val="18"/>
         </w:rPr>
-        <w:t xml:space="preserve">├── static/               interface web (index.html, claims.html)</w:t>
+        <w:t xml:space="preserve">│   └── claims_analytics.py   modèle des sinistres</w:t>
       </w:r>
     </w:p>
     <w:p>
@@ -16568,7 +17688,7 @@
           <w:sz w:val="18"/>
           <w:szCs w:val="18"/>
         </w:rPr>
-        <w:t xml:space="preserve">├── Data/                 corpus (201 fiches) et sinistres fictifs (120)</w:t>
+        <w:t xml:space="preserve">├── static/               interface web (index.html, claims.html)</w:t>
       </w:r>
     </w:p>
     <w:p>
@@ -16583,7 +17703,22 @@
           <w:sz w:val="18"/>
           <w:szCs w:val="18"/>
         </w:rPr>
-        <w:t xml:space="preserve">├── tests/                104 tests pytest</w:t>
+        <w:t xml:space="preserve">├── Data/                 corpus (201 fiches) et sinistres fictifs (120)</w:t>
+      </w:r>
+    </w:p>
+    <w:p>
+      <w:pPr>
+        <w:shd w:fill="F2F2F2" w:color="auto" w:val="clear"/>
+        <w:spacing w:after="0" w:line="240"/>
+        <w:ind w:left="240" w:right="240"/>
+      </w:pPr>
+      <w:r>
+        <w:rPr>
+          <w:rFonts w:ascii="Consolas" w:cs="Consolas" w:eastAsia="Consolas" w:hAnsi="Consolas"/>
+          <w:sz w:val="18"/>
+          <w:szCs w:val="18"/>
+        </w:rPr>
+        <w:t xml:space="preserve">├── tests/                125 tests pytest</w:t>
       </w:r>
     </w:p>
     <w:p>
@@ -17612,6 +18747,74 @@
                 <w:szCs w:val="19"/>
               </w:rPr>
               <w:t xml:space="preserve">métriques du modèle</w:t>
+            </w:r>
+          </w:p>
+        </w:tc>
+      </w:tr>
+      <w:tr>
+        <w:tc>
+          <w:tcPr>
+            <w:tcW w:type="dxa" w:w="3429"/>
+            <w:tcBorders>
+              <w:top w:val="single" w:color="BFBFBF" w:sz="4"/>
+              <w:left w:val="single" w:color="BFBFBF" w:sz="4"/>
+              <w:bottom w:val="single" w:color="BFBFBF" w:sz="4"/>
+              <w:right w:val="single" w:color="BFBFBF" w:sz="4"/>
+            </w:tcBorders>
+            <w:tcMar>
+              <w:top w:type="dxa" w:w="60"/>
+              <w:left w:type="dxa" w:w="100"/>
+              <w:bottom w:type="dxa" w:w="60"/>
+              <w:right w:type="dxa" w:w="100"/>
+            </w:tcMar>
+          </w:tcPr>
+          <w:p>
+            <w:pPr>
+              <w:spacing w:after="0" w:line="260"/>
+            </w:pPr>
+            <w:r>
+              <w:rPr>
+                <w:sz w:val="19"/>
+                <w:szCs w:val="19"/>
+              </w:rPr>
+              <w:t xml:space="preserve">GET </w:t>
+            </w:r>
+            <w:r>
+              <w:rPr>
+                <w:rFonts w:ascii="Consolas" w:cs="Consolas" w:eastAsia="Consolas" w:hAnsi="Consolas"/>
+                <w:sz w:val="19"/>
+                <w:szCs w:val="19"/>
+              </w:rPr>
+              <w:t xml:space="preserve">/api/claims/{id}/decision-support</w:t>
+            </w:r>
+          </w:p>
+        </w:tc>
+        <w:tc>
+          <w:tcPr>
+            <w:tcW w:type="dxa" w:w="5597"/>
+            <w:tcBorders>
+              <w:top w:val="single" w:color="BFBFBF" w:sz="4"/>
+              <w:left w:val="single" w:color="BFBFBF" w:sz="4"/>
+              <w:bottom w:val="single" w:color="BFBFBF" w:sz="4"/>
+              <w:right w:val="single" w:color="BFBFBF" w:sz="4"/>
+            </w:tcBorders>
+            <w:tcMar>
+              <w:top w:type="dxa" w:w="60"/>
+              <w:left w:type="dxa" w:w="100"/>
+              <w:bottom w:type="dxa" w:w="60"/>
+              <w:right w:type="dxa" w:w="100"/>
+            </w:tcMar>
+          </w:tcPr>
+          <w:p>
+            <w:pPr>
+              <w:spacing w:after="0" w:line="260"/>
+            </w:pPr>
+            <w:r>
+              <w:rPr>
+                <w:sz w:val="19"/>
+                <w:szCs w:val="19"/>
+              </w:rPr>
+              <w:t xml:space="preserve">score expliqué, points à vérifier, clauses, orientation</w:t>
             </w:r>
           </w:p>
         </w:tc>

</xml_diff>

<commit_message>
Recherche : départage par titre le plus centré ; sortie du modèle raccourcie
Essai réel : la fiche de définition de la responsabilité civile manquait,
plusieurs fiches ayant le même score lexical et le départage favorisant les
titres longs. Recall@5 sur le jeu tenu à part : 46,7 % -> 53,3 %.
Temps mesuré sur le Space : 225 s ; num_predict 280, deux extraits au plus.
Rapport mis à jour avec la mesure réelle.
</commit_message>
<xml_diff>
--- a/docs/rapport/Rapport_Insurance_Claims_Assistance_v19.docx
+++ b/docs/rapport/Rapport_Insurance_Claims_Assistance_v19.docx
@@ -502,7 +502,7 @@
                 <w:sz w:val="19"/>
                 <w:szCs w:val="19"/>
               </w:rPr>
-              <w:t xml:space="preserve">89,6 %</w:t>
+              <w:t xml:space="preserve">90,0 %</w:t>
             </w:r>
           </w:p>
         </w:tc>
@@ -591,7 +591,7 @@
                 <w:sz w:val="19"/>
                 <w:szCs w:val="19"/>
               </w:rPr>
-              <w:t xml:space="preserve">46,7 %</w:t>
+              <w:t xml:space="preserve">53,3 %</w:t>
             </w:r>
           </w:p>
         </w:tc>
@@ -620,7 +620,96 @@
                 <w:sz w:val="19"/>
                 <w:szCs w:val="19"/>
               </w:rPr>
-              <w:t xml:space="preserve">36,7 % sans synonymes ; mesure la plus réaliste</w:t>
+              <w:t xml:space="preserve">36,7 % au départ ; mesure la plus réaliste</w:t>
+            </w:r>
+          </w:p>
+        </w:tc>
+      </w:tr>
+      <w:tr>
+        <w:tc>
+          <w:tcPr>
+            <w:tcW w:type="dxa" w:w="3429"/>
+            <w:tcBorders>
+              <w:top w:val="single" w:color="BFBFBF" w:sz="4"/>
+              <w:left w:val="single" w:color="BFBFBF" w:sz="4"/>
+              <w:bottom w:val="single" w:color="BFBFBF" w:sz="4"/>
+              <w:right w:val="single" w:color="BFBFBF" w:sz="4"/>
+            </w:tcBorders>
+            <w:tcMar>
+              <w:top w:type="dxa" w:w="60"/>
+              <w:left w:type="dxa" w:w="100"/>
+              <w:bottom w:type="dxa" w:w="60"/>
+              <w:right w:type="dxa" w:w="100"/>
+            </w:tcMar>
+          </w:tcPr>
+          <w:p>
+            <w:pPr>
+              <w:spacing w:after="0" w:line="260"/>
+            </w:pPr>
+            <w:r>
+              <w:rPr>
+                <w:sz w:val="19"/>
+                <w:szCs w:val="19"/>
+              </w:rPr>
+              <w:t xml:space="preserve">Temps de réponse mesuré sur le Space</w:t>
+            </w:r>
+          </w:p>
+        </w:tc>
+        <w:tc>
+          <w:tcPr>
+            <w:tcW w:type="dxa" w:w="1263"/>
+            <w:tcBorders>
+              <w:top w:val="single" w:color="BFBFBF" w:sz="4"/>
+              <w:left w:val="single" w:color="BFBFBF" w:sz="4"/>
+              <w:bottom w:val="single" w:color="BFBFBF" w:sz="4"/>
+              <w:right w:val="single" w:color="BFBFBF" w:sz="4"/>
+            </w:tcBorders>
+            <w:tcMar>
+              <w:top w:type="dxa" w:w="60"/>
+              <w:left w:type="dxa" w:w="100"/>
+              <w:bottom w:type="dxa" w:w="60"/>
+              <w:right w:type="dxa" w:w="100"/>
+            </w:tcMar>
+          </w:tcPr>
+          <w:p>
+            <w:pPr>
+              <w:spacing w:after="0" w:line="260"/>
+            </w:pPr>
+            <w:r>
+              <w:rPr>
+                <w:sz w:val="19"/>
+                <w:szCs w:val="19"/>
+              </w:rPr>
+              <w:t xml:space="preserve">≈ 225 s</w:t>
+            </w:r>
+          </w:p>
+        </w:tc>
+        <w:tc>
+          <w:tcPr>
+            <w:tcW w:type="dxa" w:w="4334"/>
+            <w:tcBorders>
+              <w:top w:val="single" w:color="BFBFBF" w:sz="4"/>
+              <w:left w:val="single" w:color="BFBFBF" w:sz="4"/>
+              <w:bottom w:val="single" w:color="BFBFBF" w:sz="4"/>
+              <w:right w:val="single" w:color="BFBFBF" w:sz="4"/>
+            </w:tcBorders>
+            <w:tcMar>
+              <w:top w:type="dxa" w:w="60"/>
+              <w:left w:type="dxa" w:w="100"/>
+              <w:bottom w:type="dxa" w:w="60"/>
+              <w:right w:type="dxa" w:w="100"/>
+            </w:tcMar>
+          </w:tcPr>
+          <w:p>
+            <w:pPr>
+              <w:spacing w:after="0" w:line="260"/>
+            </w:pPr>
+            <w:r>
+              <w:rPr>
+                <w:sz w:val="19"/>
+                <w:szCs w:val="19"/>
+              </w:rPr>
+              <w:t xml:space="preserve">processeur sans GPU, deux appels au modèle ; principale limite</w:t>
             </w:r>
           </w:p>
         </w:tc>
@@ -6549,10 +6638,10 @@
           <w:sz w:val="19"/>
           <w:szCs w:val="19"/>
         </w:rPr>
-        <w:t xml:space="preserve">num_predict = 350</w:t>
-      </w:r>
-      <w:r>
-        <w:t xml:space="preserve"> jetons, réponse en trois phrases au plus), fenêtre de contexte réduite à 2 048 jetons (</w:t>
+        <w:t xml:space="preserve">num_predict = 280</w:t>
+      </w:r>
+      <w:r>
+        <w:t xml:space="preserve"> jetons, réponse en trois phrases au plus, deux extraits au plus), fenêtre de contexte réduite à 2 048 jetons (</w:t>
       </w:r>
       <w:r>
         <w:rPr>
@@ -6579,25 +6668,68 @@
     </w:p>
     <w:p>
       <w:pPr>
-        <w:pBdr>
-          <w:left w:val="single" w:color="2E75B6" w:sz="18" w:space="8"/>
-        </w:pBdr>
-        <w:shd w:fill="DEEAF6" w:color="auto" w:val="clear"/>
-        <w:spacing w:after="160" w:before="80" w:line="276"/>
-        <w:ind w:left="200" w:right="200"/>
-      </w:pPr>
-      <w:r>
-        <w:t xml:space="preserve">Ces gains sont </w:t>
+        <w:pStyle w:val="Heading3"/>
+      </w:pPr>
+      <w:r>
+        <w:t xml:space="preserve">Mesure réelle et enseignement</w:t>
+      </w:r>
+    </w:p>
+    <w:p>
+      <w:pPr>
+        <w:spacing w:after="120" w:line="288"/>
+        <w:jc w:val="both"/>
+      </w:pPr>
+      <w:r>
+        <w:t xml:space="preserve">Mesure sur le Space après déploiement de la version 19, question « c’est quoi l’assurance responsabilité civile ? » : réponse </w:t>
       </w:r>
       <w:r>
         <w:rPr>
           <w:b/>
           <w:bCs/>
         </w:rPr>
-        <w:t xml:space="preserve">estimés</w:t>
-      </w:r>
-      <w:r>
-        <w:t xml:space="preserve"> à partir de la quantité de texte lue par le modèle ; ils n’ont pas encore été chronométrés sur le Space. L’interface affiche, pour chaque question, la durée de génération, le nombre d’appels et le nombre de sources lues, ce qui permet de les mesurer directement. Si le temps reste trop long, le modèle peut être remplacé par une version plus petite (</w:t>
+        <w:t xml:space="preserve">partielle mais justifiée</w:t>
+      </w:r>
+      <w:r>
+        <w:t xml:space="preserve">, deux extraits vérifiés, trois sources lues en </w:t>
+      </w:r>
+      <w:r>
+        <w:rPr>
+          <w:b/>
+          <w:bCs/>
+        </w:rPr>
+        <w:t xml:space="preserve">deux appels</w:t>
+      </w:r>
+      <w:r>
+        <w:t xml:space="preserve">, génération en </w:t>
+      </w:r>
+      <w:r>
+        <w:rPr>
+          <w:b/>
+          <w:bCs/>
+        </w:rPr>
+        <w:t xml:space="preserve">225 secondes</w:t>
+      </w:r>
+      <w:r>
+        <w:t xml:space="preserve">, contre 228 secondes en version 7.6 pour une réponse finalement rejetée. La qualité a nettement progressé ; le temps, non.</w:t>
+      </w:r>
+    </w:p>
+    <w:p>
+      <w:pPr>
+        <w:spacing w:after="120" w:line="288"/>
+        <w:jc w:val="both"/>
+      </w:pPr>
+      <w:r>
+        <w:t xml:space="preserve">L’enseignement est important : sur ce processeur, le temps n’est pas dominé par la lecture du contexte, comme supposé, mais par la </w:t>
+      </w:r>
+      <w:r>
+        <w:rPr>
+          <w:b/>
+          <w:bCs/>
+        </w:rPr>
+        <w:t xml:space="preserve">production des jetons de sortie</w:t>
+      </w:r>
+      <w:r>
+        <w:t xml:space="preserve">, que la réponse JSON (réponse, extraits recopiés, réserves) rend plus longue. La boucle n’économise du temps que lorsque la première source suffit. Deux réglages en découlent : sortie limitée à 280 jetons et deux extraits au plus. Le levier décisif reste le matériel ou la taille du modèle : </w:t>
       </w:r>
       <w:r>
         <w:rPr>
@@ -6605,10 +6737,21 @@
           <w:sz w:val="19"/>
           <w:szCs w:val="19"/>
         </w:rPr>
-        <w:t xml:space="preserve">OLLAMA_MODEL=llama3.2:1b</w:t>
-      </w:r>
-      <w:r>
-        <w:t xml:space="preserve">) sans modifier le code, au prix d’une qualité de rédaction moindre.</w:t>
+        <w:t xml:space="preserve">llama3.2:1b</w:t>
+      </w:r>
+      <w:r>
+        <w:t xml:space="preserve"> (variable </w:t>
+      </w:r>
+      <w:r>
+        <w:rPr>
+          <w:rFonts w:ascii="Consolas" w:cs="Consolas" w:eastAsia="Consolas" w:hAnsi="Consolas"/>
+          <w:sz w:val="19"/>
+          <w:szCs w:val="19"/>
+        </w:rPr>
+        <w:t xml:space="preserve">OLLAMA_MODEL</w:t>
+      </w:r>
+      <w:r>
+        <w:t xml:space="preserve">, sans modifier le code) ou un Space avec GPU. Cette hypothèse corrigée par la mesure illustre la démarche du projet : on ne présume pas un gain, on le chronomètre.</w:t>
       </w:r>
     </w:p>
     <w:p>
@@ -10555,7 +10698,7 @@
                 <w:sz w:val="19"/>
                 <w:szCs w:val="19"/>
               </w:rPr>
-              <w:t xml:space="preserve">125 tests ; jeu tenu à part : 36,7 % → 46,7 % ; texte lu − 50 à − 64 %</w:t>
+              <w:t xml:space="preserve">jeu tenu à part : 36,7 % → 53,3 % ; qualité des réponses en hausse, temps inchangé (225 s)</w:t>
             </w:r>
           </w:p>
         </w:tc>
@@ -12279,7 +12422,7 @@
                 <w:sz w:val="19"/>
                 <w:szCs w:val="19"/>
               </w:rPr>
-              <w:t xml:space="preserve">92,5 %</w:t>
+              <w:t xml:space="preserve">92,0 %</w:t>
             </w:r>
           </w:p>
         </w:tc>
@@ -12366,7 +12509,7 @@
                 <w:sz w:val="19"/>
                 <w:szCs w:val="19"/>
               </w:rPr>
-              <w:t xml:space="preserve">0,955</w:t>
+              <w:t xml:space="preserve">0,953</w:t>
             </w:r>
           </w:p>
         </w:tc>
@@ -12397,7 +12540,7 @@
                 <w:sz w:val="19"/>
                 <w:szCs w:val="19"/>
               </w:rPr>
-              <w:t xml:space="preserve">Hybride sans synonymes (7.6)</w:t>
+              <w:t xml:space="preserve">Hybride sans synonymes</w:t>
             </w:r>
           </w:p>
         </w:tc>
@@ -12426,7 +12569,7 @@
                 <w:sz w:val="19"/>
                 <w:szCs w:val="19"/>
               </w:rPr>
-              <w:t xml:space="preserve">52,7 %</w:t>
+              <w:t xml:space="preserve">51,7 %</w:t>
             </w:r>
           </w:p>
         </w:tc>
@@ -12455,7 +12598,7 @@
                 <w:sz w:val="19"/>
                 <w:szCs w:val="19"/>
               </w:rPr>
-              <w:t xml:space="preserve">79,1 %</w:t>
+              <w:t xml:space="preserve">81,1 %</w:t>
             </w:r>
           </w:p>
         </w:tc>
@@ -12484,7 +12627,7 @@
                 <w:sz w:val="19"/>
                 <w:szCs w:val="19"/>
               </w:rPr>
-              <w:t xml:space="preserve">89,6 %</w:t>
+              <w:t xml:space="preserve">90,5 %</w:t>
             </w:r>
           </w:p>
         </w:tc>
@@ -12513,7 +12656,7 @@
                 <w:sz w:val="19"/>
                 <w:szCs w:val="19"/>
               </w:rPr>
-              <w:t xml:space="preserve">0,667</w:t>
+              <w:t xml:space="preserve">0,665</w:t>
             </w:r>
           </w:p>
         </w:tc>
@@ -12573,7 +12716,7 @@
                 <w:sz w:val="19"/>
                 <w:szCs w:val="19"/>
               </w:rPr>
-              <w:t xml:space="preserve">53,2 %</w:t>
+              <w:t xml:space="preserve">52,2 %</w:t>
             </w:r>
           </w:p>
         </w:tc>
@@ -12602,7 +12745,7 @@
                 <w:sz w:val="19"/>
                 <w:szCs w:val="19"/>
               </w:rPr>
-              <w:t xml:space="preserve">80,1 %</w:t>
+              <w:t xml:space="preserve">82,1 %</w:t>
             </w:r>
           </w:p>
         </w:tc>
@@ -12631,7 +12774,7 @@
                 <w:sz w:val="19"/>
                 <w:szCs w:val="19"/>
               </w:rPr>
-              <w:t xml:space="preserve">89,6 %</w:t>
+              <w:t xml:space="preserve">90,0 %</w:t>
             </w:r>
           </w:p>
         </w:tc>
@@ -12660,7 +12803,7 @@
                 <w:sz w:val="19"/>
                 <w:szCs w:val="19"/>
               </w:rPr>
-              <w:t xml:space="preserve">0,672</w:t>
+              <w:t xml:space="preserve">0,670</w:t>
             </w:r>
           </w:p>
         </w:tc>
@@ -13046,7 +13189,7 @@
                 <w:sz w:val="19"/>
                 <w:szCs w:val="19"/>
               </w:rPr>
-              <w:t xml:space="preserve">42,5 %</w:t>
+              <w:t xml:space="preserve">45,0 %</w:t>
             </w:r>
           </w:p>
         </w:tc>
@@ -13075,7 +13218,7 @@
                 <w:sz w:val="19"/>
                 <w:szCs w:val="19"/>
               </w:rPr>
-              <w:t xml:space="preserve">0,250</w:t>
+              <w:t xml:space="preserve">0,257</w:t>
             </w:r>
           </w:p>
         </w:tc>
@@ -13106,7 +13249,7 @@
                 <w:sz w:val="19"/>
                 <w:szCs w:val="19"/>
               </w:rPr>
-              <w:t xml:space="preserve">Hybride sans synonymes (7.6)</w:t>
+              <w:t xml:space="preserve">Hybride sans synonymes</w:t>
             </w:r>
           </w:p>
         </w:tc>
@@ -13135,7 +13278,7 @@
                 <w:sz w:val="19"/>
                 <w:szCs w:val="19"/>
               </w:rPr>
-              <w:t xml:space="preserve">15,0 %</w:t>
+              <w:t xml:space="preserve">20,0 %</w:t>
             </w:r>
           </w:p>
         </w:tc>
@@ -13164,7 +13307,7 @@
                 <w:sz w:val="19"/>
                 <w:szCs w:val="19"/>
               </w:rPr>
-              <w:t xml:space="preserve">37,5 %</w:t>
+              <w:t xml:space="preserve">40,0 %</w:t>
             </w:r>
           </w:p>
         </w:tc>
@@ -13193,7 +13336,7 @@
                 <w:sz w:val="19"/>
                 <w:szCs w:val="19"/>
               </w:rPr>
-              <w:t xml:space="preserve">40,0 %</w:t>
+              <w:t xml:space="preserve">45,0 %</w:t>
             </w:r>
           </w:p>
         </w:tc>
@@ -13222,7 +13365,7 @@
                 <w:sz w:val="19"/>
                 <w:szCs w:val="19"/>
               </w:rPr>
-              <w:t xml:space="preserve">0,256</w:t>
+              <w:t xml:space="preserve">0,304</w:t>
             </w:r>
           </w:p>
         </w:tc>
@@ -13282,7 +13425,7 @@
                 <w:sz w:val="19"/>
                 <w:szCs w:val="19"/>
               </w:rPr>
-              <w:t xml:space="preserve">27,5 %</w:t>
+              <w:t xml:space="preserve">30,0 %</w:t>
             </w:r>
           </w:p>
         </w:tc>
@@ -13311,7 +13454,7 @@
                 <w:sz w:val="19"/>
                 <w:szCs w:val="19"/>
               </w:rPr>
-              <w:t xml:space="preserve">55,0 %</w:t>
+              <w:t xml:space="preserve">50,0 %</w:t>
             </w:r>
           </w:p>
         </w:tc>
@@ -13340,7 +13483,7 @@
                 <w:sz w:val="19"/>
                 <w:szCs w:val="19"/>
               </w:rPr>
-              <w:t xml:space="preserve">67,5 %</w:t>
+              <w:t xml:space="preserve">62,5 %</w:t>
             </w:r>
           </w:p>
         </w:tc>
@@ -13369,7 +13512,7 @@
                 <w:sz w:val="19"/>
                 <w:szCs w:val="19"/>
               </w:rPr>
-              <w:t xml:space="preserve">0,425</w:t>
+              <w:t xml:space="preserve">0,419</w:t>
             </w:r>
           </w:p>
         </w:tc>
@@ -13815,7 +13958,7 @@
                 <w:sz w:val="19"/>
                 <w:szCs w:val="19"/>
               </w:rPr>
-              <w:t xml:space="preserve">Hybride sans synonymes (7.6)</w:t>
+              <w:t xml:space="preserve">Hybride sans synonymes</w:t>
             </w:r>
           </w:p>
         </w:tc>
@@ -13844,7 +13987,7 @@
                 <w:sz w:val="19"/>
                 <w:szCs w:val="19"/>
               </w:rPr>
-              <w:t xml:space="preserve">23,3 %</w:t>
+              <w:t xml:space="preserve">26,7 %</w:t>
             </w:r>
           </w:p>
         </w:tc>
@@ -13902,7 +14045,7 @@
                 <w:sz w:val="19"/>
                 <w:szCs w:val="19"/>
               </w:rPr>
-              <w:t xml:space="preserve">36,7 %</w:t>
+              <w:t xml:space="preserve">40,0 %</w:t>
             </w:r>
           </w:p>
         </w:tc>
@@ -13931,7 +14074,7 @@
                 <w:sz w:val="19"/>
                 <w:szCs w:val="19"/>
               </w:rPr>
-              <w:t xml:space="preserve">0,274</w:t>
+              <w:t xml:space="preserve">0,305</w:t>
             </w:r>
           </w:p>
         </w:tc>
@@ -13991,7 +14134,7 @@
                 <w:sz w:val="19"/>
                 <w:szCs w:val="19"/>
               </w:rPr>
-              <w:t xml:space="preserve">33,3 %</w:t>
+              <w:t xml:space="preserve">36,7 %</w:t>
             </w:r>
           </w:p>
         </w:tc>
@@ -14020,7 +14163,7 @@
                 <w:sz w:val="19"/>
                 <w:szCs w:val="19"/>
               </w:rPr>
-              <w:t xml:space="preserve">40,0 %</w:t>
+              <w:t xml:space="preserve">43,3 %</w:t>
             </w:r>
           </w:p>
         </w:tc>
@@ -14049,7 +14192,7 @@
                 <w:sz w:val="19"/>
                 <w:szCs w:val="19"/>
               </w:rPr>
-              <w:t xml:space="preserve">46,7 %</w:t>
+              <w:t xml:space="preserve">53,3 %</w:t>
             </w:r>
           </w:p>
         </w:tc>
@@ -14078,7 +14221,7 @@
                 <w:sz w:val="19"/>
                 <w:szCs w:val="19"/>
               </w:rPr>
-              <w:t xml:space="preserve">0,371</w:t>
+              <w:t xml:space="preserve">0,418</w:t>
             </w:r>
           </w:p>
         </w:tc>
@@ -14102,26 +14245,29 @@
     </w:p>
     <w:p>
       <w:pPr>
-        <w:pStyle w:val="Heading2"/>
-      </w:pPr>
-      <w:r>
-        <w:t xml:space="preserve">7.3 Interprétation</w:t>
-      </w:r>
-    </w:p>
-    <w:p>
-      <w:pPr>
         <w:spacing w:after="120" w:line="288"/>
         <w:jc w:val="both"/>
       </w:pPr>
       <w:r>
+        <w:t xml:space="preserve">Ces valeurs intègrent une dernière correction issue d’un essai réel : à la question « c’est quoi l’assurance responsabilité civile ? », la fiche de définition n’apparaissait pas dans les cinq sources. Plusieurs fiches avaient exactement le même score lexical et le départage favorisait les titres les plus </w:t>
+      </w:r>
+      <w:r>
         <w:rPr>
           <w:b/>
           <w:bCs/>
         </w:rPr>
-        <w:t xml:space="preserve">Le jeu des titres surestime fortement la qualité.</w:t>
-      </w:r>
-      <w:r>
-        <w:t xml:space="preserve"> Le score lexical seul y atteint 99,5 % : la question étant le titre, elle se retrouve mot pour mot dans le titre de la fiche, que le score lexical pondère par 3. Ce protocole mesure surtout la capacité à retrouver un texte connu ; il ne doit pas servir à comparer des méthodes lexicales. Il reste utile comme test de non-régression.</w:t>
+        <w:t xml:space="preserve">longs</w:t>
+      </w:r>
+      <w:r>
+        <w:t xml:space="preserve">. Le départage retient désormais le titre qui contient le moins de termes en dehors de ceux de la question, dans les deux étapes du classement. La fiche de définition entre dans les trois premières sources, et le Recall@5 du jeu tenu à part passe de 46,7 % à 53,3 %.</w:t>
+      </w:r>
+    </w:p>
+    <w:p>
+      <w:pPr>
+        <w:pStyle w:val="Heading2"/>
+      </w:pPr>
+      <w:r>
+        <w:t xml:space="preserve">7.3 Interprétation</w:t>
       </w:r>
     </w:p>
     <w:p>
@@ -14134,30 +14280,46 @@
           <w:b/>
           <w:bCs/>
         </w:rPr>
-        <w:t xml:space="preserve">Les reformulations révèlent la vraie limite, et les synonymes la réduisent.</w:t>
-      </w:r>
-      <w:r>
-        <w:t xml:space="preserve"> Sans synonymes, la bonne fiche n’apparaît dans les cinq premiers résultats que pour 40 % des reformulations de développement et 36,7 % des reformulations tenues à part. Avec le dictionnaire, ces taux passent à 67,5 % et </w:t>
-      </w:r>
+        <w:t xml:space="preserve">Le jeu des titres surestime fortement la qualité.</w:t>
+      </w:r>
+      <w:r>
+        <w:t xml:space="preserve"> Le score lexical seul y atteint 99,5 % : la question étant le titre, elle se retrouve mot pour mot dans le titre de la fiche, que le score lexical pondère par 3. Ce protocole mesure surtout la capacité à retrouver un texte connu ; il ne doit pas servir à comparer des méthodes lexicales. Il reste utile comme test de non-régression.</w:t>
+      </w:r>
+    </w:p>
+    <w:p>
+      <w:pPr>
+        <w:spacing w:after="120" w:line="288"/>
+        <w:jc w:val="both"/>
+      </w:pPr>
       <w:r>
         <w:rPr>
           <w:b/>
           <w:bCs/>
         </w:rPr>
-        <w:t xml:space="preserve">46,7 %</w:t>
-      </w:r>
-      <w:r>
-        <w:t xml:space="preserve">. L’écart entre les deux jeux (+27,5 points contre +10 points) est attendu : le premier a servi à rédiger le dictionnaire, le second non. Le chiffre à retenir est donc </w:t>
+        <w:t xml:space="preserve">Les reformulations révèlent la vraie limite, et les synonymes la réduisent.</w:t>
+      </w:r>
+      <w:r>
+        <w:t xml:space="preserve"> Sans synonymes, la bonne fiche n’apparaît dans les cinq premiers résultats que pour 45 % des reformulations de développement et 40 % des reformulations tenues à part. Avec le dictionnaire, ces taux passent à 62,5 % et </w:t>
       </w:r>
       <w:r>
         <w:rPr>
           <w:b/>
           <w:bCs/>
         </w:rPr>
-        <w:t xml:space="preserve">+10 points sur le jeu tenu à part</w:t>
-      </w:r>
-      <w:r>
-        <w:t xml:space="preserve">, soit 3 questions sur 30 ; c’est un gain réel mais mesuré sur un petit échantillon. Le dictionnaire ne dégrade aucun jeu, y compris les titres. Le score lexical seul atteint 50 % sur le jeu tenu à part : la fusion avec TF-IDF ne l’améliore pas sur ces questions, un point à surveiller avec un jeu plus grand.</w:t>
+        <w:t xml:space="preserve">53,3 %</w:t>
+      </w:r>
+      <w:r>
+        <w:t xml:space="preserve">. Le chiffre à retenir est </w:t>
+      </w:r>
+      <w:r>
+        <w:rPr>
+          <w:b/>
+          <w:bCs/>
+        </w:rPr>
+        <w:t xml:space="preserve">+13,3 points sur le jeu tenu à part</w:t>
+      </w:r>
+      <w:r>
+        <w:t xml:space="preserve"> (4 questions sur 30), jeu qui n’a pas servi à rédiger le dictionnaire ; le gain est réel mais mesuré sur un petit échantillon. Sur les titres, les synonymes coûtent une question sur 201 (90,5 % contre 90,0 %), une perte tolérée et surveillée par les tests.</w:t>
       </w:r>
     </w:p>
     <w:p>
@@ -14173,7 +14335,7 @@
         <w:t xml:space="preserve">Comparaison avec l’historique.</w:t>
       </w:r>
       <w:r>
-        <w:t xml:space="preserve"> Sur le jeu des titres, les versions avec embeddings multilingues obtenaient 67,2 % de Recall@5, et 76,1 % après reclassement par CrossEncoder (résultats consignés dans les fichiers historiques, non rejoués). La version actuelle affiche 89,6 %, mais ce chiffre est gonflé par le biais lexical décrit ci-dessus : il ne permet </w:t>
+        <w:t xml:space="preserve"> Sur le jeu des titres, les versions avec embeddings multilingues obtenaient 67,2 % de Recall@5, et 76,1 % après reclassement par CrossEncoder (résultats consignés dans les fichiers historiques, non rejoués). La version actuelle affiche 90,0 %, mais ce chiffre est gonflé par le biais lexical décrit ci-dessus : il ne permet </w:t>
       </w:r>
       <w:r>
         <w:rPr>
@@ -14196,7 +14358,7 @@
         <w:ind w:left="200" w:right="200"/>
       </w:pPr>
       <w:r>
-        <w:t xml:space="preserve">Conclusion de l’évaluation : la recherche est fiable lorsque la question reprend le vocabulaire des fiches ; face aux reformulations, les synonymes métier font passer le Recall@5 de 36,7 % à 46,7 % sur des questions jamais vues, ce qui reste insuffisant pour un usage sans contrôle. C’est pourquoi la génération est conçue pour refuser (</w:t>
+        <w:t xml:space="preserve">Conclusion de l’évaluation : la recherche est fiable lorsque la question reprend le vocabulaire des fiches ; face aux reformulations, les synonymes métier et le départage corrigé font passer le Recall@5 de 36,7 % (version initiale) à 53,3 % sur des questions jamais vues, ce qui reste insuffisant pour un usage sans contrôle. C’est pourquoi la génération est conçue pour refuser (</w:t>
       </w:r>
       <w:r>
         <w:rPr>
@@ -15783,7 +15945,7 @@
                 <w:sz w:val="19"/>
                 <w:szCs w:val="19"/>
               </w:rPr>
-              <w:t xml:space="preserve">350</w:t>
+              <w:t xml:space="preserve">280</w:t>
             </w:r>
           </w:p>
         </w:tc>
@@ -17217,7 +17379,7 @@
         <w:t xml:space="preserve">Sensibilité au vocabulaire</w:t>
       </w:r>
       <w:r>
-        <w:t xml:space="preserve"> : 46,7 % de Recall@5 sur les reformulations tenues à part, malgré le dictionnaire de synonymes, qui ne couvre que les rapprochements prévus.</w:t>
+        <w:t xml:space="preserve"> : 53,3 % de Recall@5 sur les reformulations tenues à part, malgré le dictionnaire de synonymes, qui ne couvre que les rapprochements prévus.</w:t>
       </w:r>
     </w:p>
     <w:p>
@@ -17378,10 +17540,10 @@
           <w:b/>
           <w:bCs/>
         </w:rPr>
-        <w:t xml:space="preserve">Temps de réponse non mesuré après optimisation</w:t>
-      </w:r>
-      <w:r>
-        <w:t xml:space="preserve"> : la réduction du texte lu est calculée, pas encore chronométrée sur le Space.</w:t>
+        <w:t xml:space="preserve">Temps de réponse</w:t>
+      </w:r>
+      <w:r>
+        <w:t xml:space="preserve"> : environ 225 secondes sur le processeur gratuit du Space, inacceptable pour un usage métier ; la production impose un GPU ou un modèle plus petit.</w:t>
       </w:r>
     </w:p>
     <w:p>
@@ -17406,10 +17568,10 @@
           <w:b/>
           <w:bCs/>
         </w:rPr>
-        <w:t xml:space="preserve">Chronométrer la boucle sur le Space</w:t>
-      </w:r>
-      <w:r>
-        <w:t xml:space="preserve"> et choisir le modèle (3B ou 1B) selon le compromis temps / qualité observé ; distinguer les questions de liste ou de comparaison, qui doivent lire plusieurs sources d’emblée.</w:t>
+        <w:t xml:space="preserve">Comparer 3B et 1B sur le Space</w:t>
+      </w:r>
+      <w:r>
+        <w:t xml:space="preserve">, en temps et en proportion de réponses justifiées, puis choisir ; à terme, un serveur GPU ramène la génération à quelques secondes.</w:t>
       </w:r>
     </w:p>
     <w:p>

</xml_diff>

<commit_message>
Modèle 1B par défaut ; l'application tranche les indicateurs contradictoires
Mesure sur le Space, même question : 3B 260 s, 1B 115 s. Le 1B déclarait
« non trouvé » tout en fournissant des extraits vérifiés : la réponse passe
alors en « partielle » et l'incohérence est affichée. Entités HTML décodées.
Rapport : comparaison mesurée des deux modèles.
</commit_message>
<xml_diff>
--- a/docs/rapport/Rapport_Insurance_Claims_Assistance_v19.docx
+++ b/docs/rapport/Rapport_Insurance_Claims_Assistance_v19.docx
@@ -241,7 +241,7 @@
           <w:sz w:val="19"/>
           <w:szCs w:val="19"/>
         </w:rPr>
-        <w:t xml:space="preserve">llama3.2:3b</w:t>
+        <w:t xml:space="preserve">llama3.2:1b</w:t>
       </w:r>
       <w:r>
         <w:t xml:space="preserve">, servi par Ollama). Le modèle renvoie une </w:t>
@@ -680,7 +680,7 @@
                 <w:sz w:val="19"/>
                 <w:szCs w:val="19"/>
               </w:rPr>
-              <w:t xml:space="preserve">≈ 225 s</w:t>
+              <w:t xml:space="preserve">≈ 115 s</w:t>
             </w:r>
           </w:p>
         </w:tc>
@@ -709,7 +709,7 @@
                 <w:sz w:val="19"/>
                 <w:szCs w:val="19"/>
               </w:rPr>
-              <w:t xml:space="preserve">processeur sans GPU, deux appels au modèle ; principale limite</w:t>
+              <w:t xml:space="preserve">modèle 1B sur processeur sans GPU (260 s avec le 3B) ; principale limite</w:t>
             </w:r>
           </w:p>
         </w:tc>
@@ -2335,7 +2335,7 @@
           <w:sz w:val="18"/>
           <w:szCs w:val="18"/>
         </w:rPr>
-        <w:t xml:space="preserve">   RÉPONSE TYPÉE (Ollama, llama3.2:3b, JSON)       │</w:t>
+        <w:t xml:space="preserve">   RÉPONSE TYPÉE (Ollama, llama3.2:1b, JSON)       │</w:t>
       </w:r>
     </w:p>
     <w:p>
@@ -6752,6 +6752,551 @@
       </w:r>
       <w:r>
         <w:t xml:space="preserve">, sans modifier le code) ou un Space avec GPU. Cette hypothèse corrigée par la mesure illustre la démarche du projet : on ne présume pas un gain, on le chronomètre.</w:t>
+      </w:r>
+    </w:p>
+    <w:p>
+      <w:pPr>
+        <w:pStyle w:val="Heading3"/>
+      </w:pPr>
+      <w:r>
+        <w:t xml:space="preserve">Choix du modèle : 3B ou 1B, mesuré sur la même question</w:t>
+      </w:r>
+    </w:p>
+    <w:tbl>
+      <w:tblPr>
+        <w:tblW w:type="dxa" w:w="9026"/>
+        <w:tblBorders>
+          <w:top w:val="single" w:color="auto" w:sz="4"/>
+          <w:left w:val="single" w:color="auto" w:sz="4"/>
+          <w:bottom w:val="single" w:color="auto" w:sz="4"/>
+          <w:right w:val="single" w:color="auto" w:sz="4"/>
+          <w:insideH w:val="single" w:color="auto" w:sz="4"/>
+          <w:insideV w:val="single" w:color="auto" w:sz="4"/>
+        </w:tblBorders>
+      </w:tblPr>
+      <w:tblGrid>
+        <w:gridCol w:w="2707"/>
+        <w:gridCol w:w="2707"/>
+        <w:gridCol w:w="3612"/>
+      </w:tblGrid>
+      <w:tr>
+        <w:trPr>
+          <w:tblHeader/>
+        </w:trPr>
+        <w:tc>
+          <w:tcPr>
+            <w:tcW w:type="dxa" w:w="2707"/>
+            <w:tcBorders>
+              <w:top w:val="single" w:color="BFBFBF" w:sz="4"/>
+              <w:left w:val="single" w:color="BFBFBF" w:sz="4"/>
+              <w:bottom w:val="single" w:color="BFBFBF" w:sz="4"/>
+              <w:right w:val="single" w:color="BFBFBF" w:sz="4"/>
+            </w:tcBorders>
+            <w:shd w:fill="1F3864" w:color="auto" w:val="clear"/>
+            <w:tcMar>
+              <w:top w:type="dxa" w:w="60"/>
+              <w:left w:type="dxa" w:w="100"/>
+              <w:bottom w:type="dxa" w:w="60"/>
+              <w:right w:type="dxa" w:w="100"/>
+            </w:tcMar>
+          </w:tcPr>
+          <w:p>
+            <w:pPr>
+              <w:spacing w:after="0" w:line="260"/>
+            </w:pPr>
+            <w:r>
+              <w:rPr>
+                <w:b/>
+                <w:bCs/>
+                <w:color w:val="FFFFFF"/>
+                <w:sz w:val="19"/>
+                <w:szCs w:val="19"/>
+              </w:rPr>
+              <w:t xml:space="preserve">Critère</w:t>
+            </w:r>
+          </w:p>
+        </w:tc>
+        <w:tc>
+          <w:tcPr>
+            <w:tcW w:type="dxa" w:w="2707"/>
+            <w:tcBorders>
+              <w:top w:val="single" w:color="BFBFBF" w:sz="4"/>
+              <w:left w:val="single" w:color="BFBFBF" w:sz="4"/>
+              <w:bottom w:val="single" w:color="BFBFBF" w:sz="4"/>
+              <w:right w:val="single" w:color="BFBFBF" w:sz="4"/>
+            </w:tcBorders>
+            <w:shd w:fill="1F3864" w:color="auto" w:val="clear"/>
+            <w:tcMar>
+              <w:top w:type="dxa" w:w="60"/>
+              <w:left w:type="dxa" w:w="100"/>
+              <w:bottom w:type="dxa" w:w="60"/>
+              <w:right w:type="dxa" w:w="100"/>
+            </w:tcMar>
+          </w:tcPr>
+          <w:p>
+            <w:pPr>
+              <w:spacing w:after="0" w:line="260"/>
+            </w:pPr>
+            <w:r>
+              <w:rPr>
+                <w:b/>
+                <w:bCs/>
+                <w:color w:val="FFFFFF"/>
+                <w:sz w:val="19"/>
+                <w:szCs w:val="19"/>
+              </w:rPr>
+              <w:t xml:space="preserve">llama3.2:3b</w:t>
+            </w:r>
+          </w:p>
+        </w:tc>
+        <w:tc>
+          <w:tcPr>
+            <w:tcW w:type="dxa" w:w="3612"/>
+            <w:tcBorders>
+              <w:top w:val="single" w:color="BFBFBF" w:sz="4"/>
+              <w:left w:val="single" w:color="BFBFBF" w:sz="4"/>
+              <w:bottom w:val="single" w:color="BFBFBF" w:sz="4"/>
+              <w:right w:val="single" w:color="BFBFBF" w:sz="4"/>
+            </w:tcBorders>
+            <w:shd w:fill="1F3864" w:color="auto" w:val="clear"/>
+            <w:tcMar>
+              <w:top w:type="dxa" w:w="60"/>
+              <w:left w:type="dxa" w:w="100"/>
+              <w:bottom w:type="dxa" w:w="60"/>
+              <w:right w:type="dxa" w:w="100"/>
+            </w:tcMar>
+          </w:tcPr>
+          <w:p>
+            <w:pPr>
+              <w:spacing w:after="0" w:line="260"/>
+            </w:pPr>
+            <w:r>
+              <w:rPr>
+                <w:b/>
+                <w:bCs/>
+                <w:color w:val="FFFFFF"/>
+                <w:sz w:val="19"/>
+                <w:szCs w:val="19"/>
+              </w:rPr>
+              <w:t xml:space="preserve">llama3.2:1b</w:t>
+            </w:r>
+          </w:p>
+        </w:tc>
+      </w:tr>
+      <w:tr>
+        <w:tc>
+          <w:tcPr>
+            <w:tcW w:type="dxa" w:w="2707"/>
+            <w:tcBorders>
+              <w:top w:val="single" w:color="BFBFBF" w:sz="4"/>
+              <w:left w:val="single" w:color="BFBFBF" w:sz="4"/>
+              <w:bottom w:val="single" w:color="BFBFBF" w:sz="4"/>
+              <w:right w:val="single" w:color="BFBFBF" w:sz="4"/>
+            </w:tcBorders>
+            <w:tcMar>
+              <w:top w:type="dxa" w:w="60"/>
+              <w:left w:type="dxa" w:w="100"/>
+              <w:bottom w:type="dxa" w:w="60"/>
+              <w:right w:type="dxa" w:w="100"/>
+            </w:tcMar>
+          </w:tcPr>
+          <w:p>
+            <w:pPr>
+              <w:spacing w:after="0" w:line="260"/>
+            </w:pPr>
+            <w:r>
+              <w:rPr>
+                <w:sz w:val="19"/>
+                <w:szCs w:val="19"/>
+              </w:rPr>
+              <w:t xml:space="preserve">Durée de génération</w:t>
+            </w:r>
+          </w:p>
+        </w:tc>
+        <w:tc>
+          <w:tcPr>
+            <w:tcW w:type="dxa" w:w="2707"/>
+            <w:tcBorders>
+              <w:top w:val="single" w:color="BFBFBF" w:sz="4"/>
+              <w:left w:val="single" w:color="BFBFBF" w:sz="4"/>
+              <w:bottom w:val="single" w:color="BFBFBF" w:sz="4"/>
+              <w:right w:val="single" w:color="BFBFBF" w:sz="4"/>
+            </w:tcBorders>
+            <w:tcMar>
+              <w:top w:type="dxa" w:w="60"/>
+              <w:left w:type="dxa" w:w="100"/>
+              <w:bottom w:type="dxa" w:w="60"/>
+              <w:right w:type="dxa" w:w="100"/>
+            </w:tcMar>
+          </w:tcPr>
+          <w:p>
+            <w:pPr>
+              <w:spacing w:after="0" w:line="260"/>
+            </w:pPr>
+            <w:r>
+              <w:rPr>
+                <w:sz w:val="19"/>
+                <w:szCs w:val="19"/>
+              </w:rPr>
+              <w:t xml:space="preserve">260 s</w:t>
+            </w:r>
+          </w:p>
+        </w:tc>
+        <w:tc>
+          <w:tcPr>
+            <w:tcW w:type="dxa" w:w="3612"/>
+            <w:tcBorders>
+              <w:top w:val="single" w:color="BFBFBF" w:sz="4"/>
+              <w:left w:val="single" w:color="BFBFBF" w:sz="4"/>
+              <w:bottom w:val="single" w:color="BFBFBF" w:sz="4"/>
+              <w:right w:val="single" w:color="BFBFBF" w:sz="4"/>
+            </w:tcBorders>
+            <w:tcMar>
+              <w:top w:type="dxa" w:w="60"/>
+              <w:left w:type="dxa" w:w="100"/>
+              <w:bottom w:type="dxa" w:w="60"/>
+              <w:right w:type="dxa" w:w="100"/>
+            </w:tcMar>
+          </w:tcPr>
+          <w:p>
+            <w:pPr>
+              <w:spacing w:after="0" w:line="260"/>
+            </w:pPr>
+            <w:r>
+              <w:rPr>
+                <w:sz w:val="19"/>
+                <w:szCs w:val="19"/>
+              </w:rPr>
+              <w:t xml:space="preserve">115 s (− 56 %)</w:t>
+            </w:r>
+          </w:p>
+        </w:tc>
+      </w:tr>
+      <w:tr>
+        <w:tc>
+          <w:tcPr>
+            <w:tcW w:type="dxa" w:w="2707"/>
+            <w:tcBorders>
+              <w:top w:val="single" w:color="BFBFBF" w:sz="4"/>
+              <w:left w:val="single" w:color="BFBFBF" w:sz="4"/>
+              <w:bottom w:val="single" w:color="BFBFBF" w:sz="4"/>
+              <w:right w:val="single" w:color="BFBFBF" w:sz="4"/>
+            </w:tcBorders>
+            <w:tcMar>
+              <w:top w:type="dxa" w:w="60"/>
+              <w:left w:type="dxa" w:w="100"/>
+              <w:bottom w:type="dxa" w:w="60"/>
+              <w:right w:type="dxa" w:w="100"/>
+            </w:tcMar>
+          </w:tcPr>
+          <w:p>
+            <w:pPr>
+              <w:spacing w:after="0" w:line="260"/>
+            </w:pPr>
+            <w:r>
+              <w:rPr>
+                <w:sz w:val="19"/>
+                <w:szCs w:val="19"/>
+              </w:rPr>
+              <w:t xml:space="preserve">Contenu de la réponse</w:t>
+            </w:r>
+          </w:p>
+        </w:tc>
+        <w:tc>
+          <w:tcPr>
+            <w:tcW w:type="dxa" w:w="2707"/>
+            <w:tcBorders>
+              <w:top w:val="single" w:color="BFBFBF" w:sz="4"/>
+              <w:left w:val="single" w:color="BFBFBF" w:sz="4"/>
+              <w:bottom w:val="single" w:color="BFBFBF" w:sz="4"/>
+              <w:right w:val="single" w:color="BFBFBF" w:sz="4"/>
+            </w:tcBorders>
+            <w:tcMar>
+              <w:top w:type="dxa" w:w="60"/>
+              <w:left w:type="dxa" w:w="100"/>
+              <w:bottom w:type="dxa" w:w="60"/>
+              <w:right w:type="dxa" w:w="100"/>
+            </w:tcMar>
+          </w:tcPr>
+          <w:p>
+            <w:pPr>
+              <w:spacing w:after="0" w:line="260"/>
+            </w:pPr>
+            <w:r>
+              <w:rPr>
+                <w:sz w:val="19"/>
+                <w:szCs w:val="19"/>
+              </w:rPr>
+              <w:t xml:space="preserve">correct</w:t>
+            </w:r>
+          </w:p>
+        </w:tc>
+        <w:tc>
+          <w:tcPr>
+            <w:tcW w:type="dxa" w:w="3612"/>
+            <w:tcBorders>
+              <w:top w:val="single" w:color="BFBFBF" w:sz="4"/>
+              <w:left w:val="single" w:color="BFBFBF" w:sz="4"/>
+              <w:bottom w:val="single" w:color="BFBFBF" w:sz="4"/>
+              <w:right w:val="single" w:color="BFBFBF" w:sz="4"/>
+            </w:tcBorders>
+            <w:tcMar>
+              <w:top w:type="dxa" w:w="60"/>
+              <w:left w:type="dxa" w:w="100"/>
+              <w:bottom w:type="dxa" w:w="60"/>
+              <w:right w:type="dxa" w:w="100"/>
+            </w:tcMar>
+          </w:tcPr>
+          <w:p>
+            <w:pPr>
+              <w:spacing w:after="0" w:line="260"/>
+            </w:pPr>
+            <w:r>
+              <w:rPr>
+                <w:sz w:val="19"/>
+                <w:szCs w:val="19"/>
+              </w:rPr>
+              <w:t xml:space="preserve">correct, très proche de la fiche de définition</w:t>
+            </w:r>
+          </w:p>
+        </w:tc>
+      </w:tr>
+      <w:tr>
+        <w:tc>
+          <w:tcPr>
+            <w:tcW w:type="dxa" w:w="2707"/>
+            <w:tcBorders>
+              <w:top w:val="single" w:color="BFBFBF" w:sz="4"/>
+              <w:left w:val="single" w:color="BFBFBF" w:sz="4"/>
+              <w:bottom w:val="single" w:color="BFBFBF" w:sz="4"/>
+              <w:right w:val="single" w:color="BFBFBF" w:sz="4"/>
+            </w:tcBorders>
+            <w:tcMar>
+              <w:top w:type="dxa" w:w="60"/>
+              <w:left w:type="dxa" w:w="100"/>
+              <w:bottom w:type="dxa" w:w="60"/>
+              <w:right w:type="dxa" w:w="100"/>
+            </w:tcMar>
+          </w:tcPr>
+          <w:p>
+            <w:pPr>
+              <w:spacing w:after="0" w:line="260"/>
+            </w:pPr>
+            <w:r>
+              <w:rPr>
+                <w:sz w:val="19"/>
+                <w:szCs w:val="19"/>
+              </w:rPr>
+              <w:t xml:space="preserve">Indicateurs typés</w:t>
+            </w:r>
+          </w:p>
+        </w:tc>
+        <w:tc>
+          <w:tcPr>
+            <w:tcW w:type="dxa" w:w="2707"/>
+            <w:tcBorders>
+              <w:top w:val="single" w:color="BFBFBF" w:sz="4"/>
+              <w:left w:val="single" w:color="BFBFBF" w:sz="4"/>
+              <w:bottom w:val="single" w:color="BFBFBF" w:sz="4"/>
+              <w:right w:val="single" w:color="BFBFBF" w:sz="4"/>
+            </w:tcBorders>
+            <w:tcMar>
+              <w:top w:type="dxa" w:w="60"/>
+              <w:left w:type="dxa" w:w="100"/>
+              <w:bottom w:type="dxa" w:w="60"/>
+              <w:right w:type="dxa" w:w="100"/>
+            </w:tcMar>
+          </w:tcPr>
+          <w:p>
+            <w:pPr>
+              <w:spacing w:after="0" w:line="260"/>
+            </w:pPr>
+            <w:r>
+              <w:rPr>
+                <w:sz w:val="19"/>
+                <w:szCs w:val="19"/>
+              </w:rPr>
+              <w:t xml:space="preserve">cohérents (« partielle »)</w:t>
+            </w:r>
+          </w:p>
+        </w:tc>
+        <w:tc>
+          <w:tcPr>
+            <w:tcW w:type="dxa" w:w="3612"/>
+            <w:tcBorders>
+              <w:top w:val="single" w:color="BFBFBF" w:sz="4"/>
+              <w:left w:val="single" w:color="BFBFBF" w:sz="4"/>
+              <w:bottom w:val="single" w:color="BFBFBF" w:sz="4"/>
+              <w:right w:val="single" w:color="BFBFBF" w:sz="4"/>
+            </w:tcBorders>
+            <w:tcMar>
+              <w:top w:type="dxa" w:w="60"/>
+              <w:left w:type="dxa" w:w="100"/>
+              <w:bottom w:type="dxa" w:w="60"/>
+              <w:right w:type="dxa" w:w="100"/>
+            </w:tcMar>
+          </w:tcPr>
+          <w:p>
+            <w:pPr>
+              <w:spacing w:after="0" w:line="260"/>
+            </w:pPr>
+            <w:r>
+              <w:rPr>
+                <w:sz w:val="19"/>
+                <w:szCs w:val="19"/>
+              </w:rPr>
+              <w:t xml:space="preserve">contradictoires : « non trouvé » avec deux extraits vérifiés</w:t>
+            </w:r>
+          </w:p>
+        </w:tc>
+      </w:tr>
+      <w:tr>
+        <w:tc>
+          <w:tcPr>
+            <w:tcW w:type="dxa" w:w="2707"/>
+            <w:tcBorders>
+              <w:top w:val="single" w:color="BFBFBF" w:sz="4"/>
+              <w:left w:val="single" w:color="BFBFBF" w:sz="4"/>
+              <w:bottom w:val="single" w:color="BFBFBF" w:sz="4"/>
+              <w:right w:val="single" w:color="BFBFBF" w:sz="4"/>
+            </w:tcBorders>
+            <w:tcMar>
+              <w:top w:type="dxa" w:w="60"/>
+              <w:left w:type="dxa" w:w="100"/>
+              <w:bottom w:type="dxa" w:w="60"/>
+              <w:right w:type="dxa" w:w="100"/>
+            </w:tcMar>
+          </w:tcPr>
+          <w:p>
+            <w:pPr>
+              <w:spacing w:after="0" w:line="260"/>
+            </w:pPr>
+            <w:r>
+              <w:rPr>
+                <w:sz w:val="19"/>
+                <w:szCs w:val="19"/>
+              </w:rPr>
+              <w:t xml:space="preserve">Confiance déclarée</w:t>
+            </w:r>
+          </w:p>
+        </w:tc>
+        <w:tc>
+          <w:tcPr>
+            <w:tcW w:type="dxa" w:w="2707"/>
+            <w:tcBorders>
+              <w:top w:val="single" w:color="BFBFBF" w:sz="4"/>
+              <w:left w:val="single" w:color="BFBFBF" w:sz="4"/>
+              <w:bottom w:val="single" w:color="BFBFBF" w:sz="4"/>
+              <w:right w:val="single" w:color="BFBFBF" w:sz="4"/>
+            </w:tcBorders>
+            <w:tcMar>
+              <w:top w:type="dxa" w:w="60"/>
+              <w:left w:type="dxa" w:w="100"/>
+              <w:bottom w:type="dxa" w:w="60"/>
+              <w:right w:type="dxa" w:w="100"/>
+            </w:tcMar>
+          </w:tcPr>
+          <w:p>
+            <w:pPr>
+              <w:spacing w:after="0" w:line="260"/>
+            </w:pPr>
+            <w:r>
+              <w:rPr>
+                <w:sz w:val="19"/>
+                <w:szCs w:val="19"/>
+              </w:rPr>
+              <w:t xml:space="preserve">90 %</w:t>
+            </w:r>
+          </w:p>
+        </w:tc>
+        <w:tc>
+          <w:tcPr>
+            <w:tcW w:type="dxa" w:w="3612"/>
+            <w:tcBorders>
+              <w:top w:val="single" w:color="BFBFBF" w:sz="4"/>
+              <w:left w:val="single" w:color="BFBFBF" w:sz="4"/>
+              <w:bottom w:val="single" w:color="BFBFBF" w:sz="4"/>
+              <w:right w:val="single" w:color="BFBFBF" w:sz="4"/>
+            </w:tcBorders>
+            <w:tcMar>
+              <w:top w:type="dxa" w:w="60"/>
+              <w:left w:type="dxa" w:w="100"/>
+              <w:bottom w:type="dxa" w:w="60"/>
+              <w:right w:type="dxa" w:w="100"/>
+            </w:tcMar>
+          </w:tcPr>
+          <w:p>
+            <w:pPr>
+              <w:spacing w:after="0" w:line="260"/>
+            </w:pPr>
+            <w:r>
+              <w:rPr>
+                <w:sz w:val="19"/>
+                <w:szCs w:val="19"/>
+              </w:rPr>
+              <w:t xml:space="preserve">50 %</w:t>
+            </w:r>
+          </w:p>
+        </w:tc>
+      </w:tr>
+    </w:tbl>
+    <w:p>
+      <w:pPr>
+        <w:spacing w:after="200" w:before="60"/>
+        <w:jc w:val="center"/>
+      </w:pPr>
+      <w:r>
+        <w:rPr>
+          <w:i/>
+          <w:iCs/>
+          <w:color w:val="595959"/>
+          <w:sz w:val="19"/>
+          <w:szCs w:val="19"/>
+        </w:rPr>
+        <w:t xml:space="preserve">Tableau 4d — Comparaison mesurée des deux modèles sur le Space</w:t>
+      </w:r>
+    </w:p>
+    <w:p>
+      <w:pPr>
+        <w:spacing w:after="120" w:line="288"/>
+        <w:jc w:val="both"/>
+      </w:pPr>
+      <w:r>
+        <w:t xml:space="preserve">Le modèle 1B est retenu par défaut : diviser l’attente par deux compte davantage pour un utilisateur métier qu’une rédaction légèrement meilleure. Son défaut, des indicateurs qui se contredisent, est neutralisé par une règle de l’application : lorsque le modèle déclare « non trouvé » alors que des extraits ont été retrouvés dans les sources, </w:t>
+      </w:r>
+      <w:r>
+        <w:rPr>
+          <w:b/>
+          <w:bCs/>
+        </w:rPr>
+        <w:t xml:space="preserve">c’est l’application qui tranche</w:t>
+      </w:r>
+      <w:r>
+        <w:t xml:space="preserve">, la réponse passe en « partielle » et l’incohérence est signalée à l’utilisateur. Ce cas illustre l’intérêt de la réponse typée : une contradiction dans un texte libre passerait inaperçue, elle devient ici détectable et corrigeable. Le modèle 3B reste disponible par la variable </w:t>
+      </w:r>
+      <w:r>
+        <w:rPr>
+          <w:rFonts w:ascii="Consolas" w:cs="Consolas" w:eastAsia="Consolas" w:hAnsi="Consolas"/>
+          <w:sz w:val="19"/>
+          <w:szCs w:val="19"/>
+        </w:rPr>
+        <w:t xml:space="preserve">OLLAMA_MODEL</w:t>
+      </w:r>
+      <w:r>
+        <w:t xml:space="preserve">.</w:t>
+      </w:r>
+    </w:p>
+    <w:p>
+      <w:pPr>
+        <w:pBdr>
+          <w:left w:val="single" w:color="2E75B6" w:sz="18" w:space="8"/>
+        </w:pBdr>
+        <w:shd w:fill="DEEAF6" w:color="auto" w:val="clear"/>
+        <w:spacing w:after="160" w:before="80" w:line="276"/>
+        <w:ind w:left="200" w:right="200"/>
+      </w:pPr>
+      <w:r>
+        <w:t xml:space="preserve">Autre limite observée sur le même essai avec le modèle 3B : la phrase de réponse reprenait la fiche S3, mais les extraits cités venaient de S1 et S2. Les extraits existaient bien dans leurs sources, sans justifier la phrase. La vérification garantit l’existence d’un extrait, pas qu’il soutient l’affirmation : un contrôle de correspondance entre la réponse et ses extraits est une piste d’amélioration.</w:t>
       </w:r>
     </w:p>
     <w:p>
@@ -15471,7 +16016,7 @@
           <w:sz w:val="19"/>
           <w:szCs w:val="19"/>
         </w:rPr>
-        <w:t xml:space="preserve">llama3.2:3b</w:t>
+        <w:t xml:space="preserve">llama3.2:1b</w:t>
       </w:r>
       <w:r>
         <w:t xml:space="preserve"> en arrière-plan, puis le précharge en mémoire ;</w:t>
@@ -15765,7 +16310,7 @@
                 <w:sz w:val="19"/>
                 <w:szCs w:val="19"/>
               </w:rPr>
-              <w:t xml:space="preserve">llama3.2:3b</w:t>
+              <w:t xml:space="preserve">llama3.2:1b</w:t>
             </w:r>
           </w:p>
         </w:tc>
@@ -16562,7 +17107,7 @@
                 <w:sz w:val="19"/>
                 <w:szCs w:val="19"/>
               </w:rPr>
-              <w:t xml:space="preserve">llama3.2:3b</w:t>
+              <w:t xml:space="preserve">llama3.2:1b</w:t>
             </w:r>
           </w:p>
         </w:tc>
@@ -17440,7 +17985,7 @@
           <w:sz w:val="19"/>
           <w:szCs w:val="19"/>
         </w:rPr>
-        <w:t xml:space="preserve">llama3.2:3b</w:t>
+        <w:t xml:space="preserve">llama3.2:1b</w:t>
       </w:r>
       <w:r>
         <w:t xml:space="preserve"> reste à relever sur le Space.</w:t>
@@ -17543,7 +18088,27 @@
         <w:t xml:space="preserve">Temps de réponse</w:t>
       </w:r>
       <w:r>
-        <w:t xml:space="preserve"> : environ 225 secondes sur le processeur gratuit du Space, inacceptable pour un usage métier ; la production impose un GPU ou un modèle plus petit.</w:t>
+        <w:t xml:space="preserve"> : environ deux minutes avec le modèle 1B sur le processeur gratuit du Space ; trop long pour un usage métier, la production impose un serveur GPU.</w:t>
+      </w:r>
+    </w:p>
+    <w:p>
+      <w:pPr>
+        <w:pStyle w:val="ListParagraph"/>
+        <w:numPr>
+          <w:ilvl w:val="0"/>
+          <w:numId w:val="4"/>
+        </w:numPr>
+        <w:spacing w:after="60" w:line="276"/>
+      </w:pPr>
+      <w:r>
+        <w:rPr>
+          <w:b/>
+          <w:bCs/>
+        </w:rPr>
+        <w:t xml:space="preserve">Cohérence réponse / extraits</w:t>
+      </w:r>
+      <w:r>
+        <w:t xml:space="preserve"> : un extrait vérifié peut exister dans sa source sans justifier la phrase de réponse (cas observé).</w:t>
       </w:r>
     </w:p>
     <w:p>
@@ -17568,10 +18133,30 @@
           <w:b/>
           <w:bCs/>
         </w:rPr>
-        <w:t xml:space="preserve">Comparer 3B et 1B sur le Space</w:t>
-      </w:r>
-      <w:r>
-        <w:t xml:space="preserve">, en temps et en proportion de réponses justifiées, puis choisir ; à terme, un serveur GPU ramène la génération à quelques secondes.</w:t>
+        <w:t xml:space="preserve">Mesurer 3B et 1B sur un jeu de questions</w:t>
+      </w:r>
+      <w:r>
+        <w:t xml:space="preserve"> (et non une seule), en temps et en proportion de réponses justifiées ; à terme, un serveur GPU ramène la génération à quelques secondes.</w:t>
+      </w:r>
+    </w:p>
+    <w:p>
+      <w:pPr>
+        <w:pStyle w:val="ListParagraph"/>
+        <w:numPr>
+          <w:ilvl w:val="0"/>
+          <w:numId w:val="6"/>
+        </w:numPr>
+        <w:spacing w:after="60" w:line="276"/>
+      </w:pPr>
+      <w:r>
+        <w:rPr>
+          <w:b/>
+          <w:bCs/>
+        </w:rPr>
+        <w:t xml:space="preserve">Contrôler la correspondance</w:t>
+      </w:r>
+      <w:r>
+        <w:t xml:space="preserve"> entre chaque phrase de la réponse et ses extraits, par exemple par recouvrement lexical, pour détecter une citation qui ne soutient pas l’affirmation.</w:t>
       </w:r>
     </w:p>
     <w:p>

</xml_diff>

<commit_message>
« Non trouvé » : ne jamais afficher un texte non vérifié
Essai réel (1B, 65 s) : « non trouvé » sans extrait mais avec un texte de
réponse. L'application affiche désormais un message de refus et les extraits
des sources les plus proches ; le texte du modèle reste dans l'API pour
l'audit.
</commit_message>
<xml_diff>
--- a/docs/rapport/Rapport_Insurance_Claims_Assistance_v19.docx
+++ b/docs/rapport/Rapport_Insurance_Claims_Assistance_v19.docx
@@ -680,7 +680,7 @@
                 <w:sz w:val="19"/>
                 <w:szCs w:val="19"/>
               </w:rPr>
-              <w:t xml:space="preserve">≈ 115 s</w:t>
+              <w:t xml:space="preserve">65 à 115 s</w:t>
             </w:r>
           </w:p>
         </w:tc>
@@ -5847,7 +5847,7 @@
                 <w:sz w:val="19"/>
                 <w:szCs w:val="19"/>
               </w:rPr>
-              <w:t xml:space="preserve">le modèle déclare que les sources ne contiennent pas la réponse</w:t>
+              <w:t xml:space="preserve">le modèle déclare que les sources ne contiennent pas la réponse, sans extrait vérifié</w:t>
             </w:r>
           </w:p>
         </w:tc>
@@ -5876,7 +5876,7 @@
                 <w:sz w:val="19"/>
                 <w:szCs w:val="19"/>
               </w:rPr>
-              <w:t xml:space="preserve">« réponse absente des documents » : refus d’inventer</w:t>
+              <w:t xml:space="preserve">message de refus et extraits des sources les plus proches ; le texte du modèle n’est pas affiché</w:t>
             </w:r>
           </w:p>
         </w:tc>
@@ -6967,7 +6967,7 @@
                 <w:sz w:val="19"/>
                 <w:szCs w:val="19"/>
               </w:rPr>
-              <w:t xml:space="preserve">115 s (− 56 %)</w:t>
+              <w:t xml:space="preserve">115 s au premier essai, 65 s au second (modèle déjà chargé)</w:t>
             </w:r>
           </w:p>
         </w:tc>
@@ -7272,7 +7272,17 @@
         <w:t xml:space="preserve">c’est l’application qui tranche</w:t>
       </w:r>
       <w:r>
-        <w:t xml:space="preserve">, la réponse passe en « partielle » et l’incohérence est signalée à l’utilisateur. Ce cas illustre l’intérêt de la réponse typée : une contradiction dans un texte libre passerait inaperçue, elle devient ici détectable et corrigeable. Le modèle 3B reste disponible par la variable </w:t>
+        <w:t xml:space="preserve">, la réponse passe en « partielle » et l’incohérence est signalée à l’utilisateur. Ce cas illustre l’intérêt de la réponse typée : une contradiction dans un texte libre passerait inaperçue, elle devient ici détectable et corrigeable. Un second essai a montré une autre forme d’incohérence : « non trouvé », </w:t>
+      </w:r>
+      <w:r>
+        <w:rPr>
+          <w:b/>
+          <w:bCs/>
+        </w:rPr>
+        <w:t xml:space="preserve">sans aucun extrait</w:t>
+      </w:r>
+      <w:r>
+        <w:t xml:space="preserve">, mais avec un texte de réponse plausible. L’application applique alors la même logique : un texte qu’elle ne peut pas vérifier n’est jamais affiché ; elle annonce qu’aucune réponse justifiée n’a été trouvée et présente les extraits des sources les plus proches. Le texte du modèle reste disponible dans la réponse de l’API pour l’audit. Le modèle 3B reste disponible par la variable </w:t>
       </w:r>
       <w:r>
         <w:rPr>

</xml_diff>